<commit_message>
TB 1.2.1.1: Added support for tool cycling & related messages
</commit_message>
<xml_diff>
--- a/TigerBridge Documentation.docx
+++ b/TigerBridge Documentation.docx
@@ -1767,6 +1767,9 @@
             <w:r>
               <w:t>Requests the positioner to stop moving</w:t>
             </w:r>
+            <w:r>
+              <w:t>.</w:t>
+            </w:r>
           </w:p>
         </w:tc>
         <w:tc>
@@ -1816,6 +1819,9 @@
             <w:r>
               <w:t>Requests the positioner to move to the provided position value</w:t>
             </w:r>
+            <w:r>
+              <w:t>.</w:t>
+            </w:r>
           </w:p>
         </w:tc>
         <w:tc>
@@ -1865,6 +1871,9 @@
             <w:r>
               <w:t>Requests a setting value from the controller</w:t>
             </w:r>
+            <w:r>
+              <w:t>.</w:t>
+            </w:r>
           </w:p>
         </w:tc>
         <w:tc>
@@ -1914,6 +1923,9 @@
             <w:r>
               <w:t>Requests the current position of the positioner</w:t>
             </w:r>
+            <w:r>
+              <w:t>.</w:t>
+            </w:r>
           </w:p>
         </w:tc>
         <w:tc>
@@ -1964,6 +1976,9 @@
             <w:r>
               <w:t>s position in relation to the tool</w:t>
             </w:r>
+            <w:r>
+              <w:t>.</w:t>
+            </w:r>
           </w:p>
         </w:tc>
         <w:tc>
@@ -2004,6 +2019,58 @@
             </w:pPr>
             <w:r>
               <w:t>Sends the positioner to the far end of the beam (relative to the tool), allowing for a consistent reference point for positioning</w:t>
+            </w:r>
+            <w:r>
+              <w:t>.</w:t>
+            </w:r>
+          </w:p>
+        </w:tc>
+        <w:tc>
+          <w:tcPr>
+            <w:tcW w:w="1975" w:type="dxa"/>
+          </w:tcPr>
+          <w:p>
+            <w:pPr>
+              <w:spacing w:line="360" w:lineRule="auto"/>
+            </w:pPr>
+            <w:r>
+              <w:t>None</w:t>
+            </w:r>
+          </w:p>
+        </w:tc>
+      </w:tr>
+      <w:tr>
+        <w:tc>
+          <w:tcPr>
+            <w:tcW w:w="2065" w:type="dxa"/>
+          </w:tcPr>
+          <w:p>
+            <w:pPr>
+              <w:spacing w:line="360" w:lineRule="auto"/>
+            </w:pPr>
+            <w:r>
+              <w:t>“</w:t>
+            </w:r>
+            <w:proofErr w:type="spellStart"/>
+            <w:r>
+              <w:t>cycle_tool</w:t>
+            </w:r>
+            <w:proofErr w:type="spellEnd"/>
+            <w:r>
+              <w:t>”</w:t>
+            </w:r>
+          </w:p>
+        </w:tc>
+        <w:tc>
+          <w:tcPr>
+            <w:tcW w:w="5310" w:type="dxa"/>
+          </w:tcPr>
+          <w:p>
+            <w:pPr>
+              <w:spacing w:line="360" w:lineRule="auto"/>
+            </w:pPr>
+            <w:r>
+              <w:t>Requests for the machine to perform a tool cycle.</w:t>
             </w:r>
           </w:p>
         </w:tc>
@@ -2185,6 +2252,9 @@
             <w:r>
               <w:t>Movement has finished</w:t>
             </w:r>
+            <w:r>
+              <w:t>.</w:t>
+            </w:r>
           </w:p>
         </w:tc>
         <w:tc>
@@ -2229,6 +2299,9 @@
             <w:r>
               <w:t>Received a setting from the controller</w:t>
             </w:r>
+            <w:r>
+              <w:t>.</w:t>
+            </w:r>
           </w:p>
         </w:tc>
         <w:tc>
@@ -2281,6 +2354,9 @@
             <w:r>
               <w:t>Received the current position of the positioner from the controller</w:t>
             </w:r>
+            <w:r>
+              <w:t>.</w:t>
+            </w:r>
           </w:p>
         </w:tc>
         <w:tc>
@@ -2325,6 +2401,9 @@
             <w:r>
               <w:t>Received an error</w:t>
             </w:r>
+            <w:r>
+              <w:t>.</w:t>
+            </w:r>
           </w:p>
         </w:tc>
         <w:tc>
@@ -2367,7 +2446,25 @@
               <w:spacing w:line="360" w:lineRule="auto"/>
             </w:pPr>
             <w:r>
-              <w:t>Tool has been engaged</w:t>
+              <w:t xml:space="preserve">Tool </w:t>
+            </w:r>
+            <w:r>
+              <w:t xml:space="preserve">SIK switch </w:t>
+            </w:r>
+            <w:r>
+              <w:t xml:space="preserve">has been </w:t>
+            </w:r>
+            <w:r>
+              <w:t>de</w:t>
+            </w:r>
+            <w:r>
+              <w:t>activated</w:t>
+            </w:r>
+            <w:r>
+              <w:t>, indicating the tool is engaged</w:t>
+            </w:r>
+            <w:r>
+              <w:t>.</w:t>
             </w:r>
           </w:p>
         </w:tc>
@@ -2411,7 +2508,22 @@
               <w:spacing w:line="360" w:lineRule="auto"/>
             </w:pPr>
             <w:r>
-              <w:t>Tool has been disengaged</w:t>
+              <w:t xml:space="preserve">Tool </w:t>
+            </w:r>
+            <w:r>
+              <w:t xml:space="preserve">SIK switch </w:t>
+            </w:r>
+            <w:r>
+              <w:t xml:space="preserve">has been </w:t>
+            </w:r>
+            <w:r>
+              <w:t>activated</w:t>
+            </w:r>
+            <w:r>
+              <w:t>, indicating the tool is no longer engaged</w:t>
+            </w:r>
+            <w:r>
+              <w:t>.</w:t>
             </w:r>
           </w:p>
         </w:tc>
@@ -2455,7 +2567,587 @@
               <w:spacing w:line="360" w:lineRule="auto"/>
             </w:pPr>
             <w:r>
-              <w:t>Calibration succeeded</w:t>
+              <w:t>Safety sensors have all indicated that the machine is safe</w:t>
+            </w:r>
+            <w:r>
+              <w:t>.</w:t>
+            </w:r>
+          </w:p>
+        </w:tc>
+        <w:tc>
+          <w:tcPr>
+            <w:tcW w:w="2785" w:type="dxa"/>
+          </w:tcPr>
+          <w:p>
+            <w:pPr>
+              <w:spacing w:line="360" w:lineRule="auto"/>
+            </w:pPr>
+            <w:r>
+              <w:t>None</w:t>
+            </w:r>
+          </w:p>
+        </w:tc>
+      </w:tr>
+      <w:tr>
+        <w:trPr>
+          <w:trHeight w:val="340"/>
+        </w:trPr>
+        <w:tc>
+          <w:tcPr>
+            <w:tcW w:w="1103" w:type="dxa"/>
+          </w:tcPr>
+          <w:p>
+            <w:pPr>
+              <w:spacing w:line="360" w:lineRule="auto"/>
+            </w:pPr>
+            <w:r>
+              <w:t>7</w:t>
+            </w:r>
+          </w:p>
+        </w:tc>
+        <w:tc>
+          <w:tcPr>
+            <w:tcW w:w="5462" w:type="dxa"/>
+          </w:tcPr>
+          <w:p>
+            <w:pPr>
+              <w:spacing w:line="360" w:lineRule="auto"/>
+            </w:pPr>
+            <w:r>
+              <w:t>The Scanning Pusher Foot’s edge detect sensor was activated, indicating material is present</w:t>
+            </w:r>
+            <w:r>
+              <w:t>.</w:t>
+            </w:r>
+          </w:p>
+        </w:tc>
+        <w:tc>
+          <w:tcPr>
+            <w:tcW w:w="2785" w:type="dxa"/>
+          </w:tcPr>
+          <w:p>
+            <w:pPr>
+              <w:spacing w:line="360" w:lineRule="auto"/>
+            </w:pPr>
+            <w:r>
+              <w:t>None</w:t>
+            </w:r>
+          </w:p>
+        </w:tc>
+      </w:tr>
+      <w:tr>
+        <w:trPr>
+          <w:trHeight w:val="340"/>
+        </w:trPr>
+        <w:tc>
+          <w:tcPr>
+            <w:tcW w:w="1103" w:type="dxa"/>
+          </w:tcPr>
+          <w:p>
+            <w:pPr>
+              <w:spacing w:line="360" w:lineRule="auto"/>
+            </w:pPr>
+            <w:r>
+              <w:t>8</w:t>
+            </w:r>
+          </w:p>
+        </w:tc>
+        <w:tc>
+          <w:tcPr>
+            <w:tcW w:w="5462" w:type="dxa"/>
+          </w:tcPr>
+          <w:p>
+            <w:pPr>
+              <w:spacing w:line="360" w:lineRule="auto"/>
+            </w:pPr>
+            <w:r>
+              <w:t xml:space="preserve">The Scanning Pusher Foot’s edge detect sensor was </w:t>
+            </w:r>
+            <w:r>
+              <w:t>de</w:t>
+            </w:r>
+            <w:r>
+              <w:t>activated</w:t>
+            </w:r>
+            <w:r>
+              <w:t>, indicating material is NOT present</w:t>
+            </w:r>
+            <w:r>
+              <w:t>.</w:t>
+            </w:r>
+          </w:p>
+        </w:tc>
+        <w:tc>
+          <w:tcPr>
+            <w:tcW w:w="2785" w:type="dxa"/>
+          </w:tcPr>
+          <w:p>
+            <w:pPr>
+              <w:spacing w:line="360" w:lineRule="auto"/>
+            </w:pPr>
+            <w:r>
+              <w:t>None</w:t>
+            </w:r>
+          </w:p>
+        </w:tc>
+      </w:tr>
+      <w:tr>
+        <w:trPr>
+          <w:trHeight w:val="340"/>
+        </w:trPr>
+        <w:tc>
+          <w:tcPr>
+            <w:tcW w:w="1103" w:type="dxa"/>
+          </w:tcPr>
+          <w:p>
+            <w:pPr>
+              <w:spacing w:line="360" w:lineRule="auto"/>
+            </w:pPr>
+            <w:r>
+              <w:t>9</w:t>
+            </w:r>
+          </w:p>
+        </w:tc>
+        <w:tc>
+          <w:tcPr>
+            <w:tcW w:w="5462" w:type="dxa"/>
+          </w:tcPr>
+          <w:p>
+            <w:pPr>
+              <w:spacing w:line="360" w:lineRule="auto"/>
+            </w:pPr>
+            <w:r>
+              <w:t>The Scanning Pusher Foot’s defect sensor was activated</w:t>
+            </w:r>
+            <w:r>
+              <w:t>.</w:t>
+            </w:r>
+          </w:p>
+        </w:tc>
+        <w:tc>
+          <w:tcPr>
+            <w:tcW w:w="2785" w:type="dxa"/>
+          </w:tcPr>
+          <w:p>
+            <w:pPr>
+              <w:spacing w:line="360" w:lineRule="auto"/>
+            </w:pPr>
+            <w:r>
+              <w:t>None</w:t>
+            </w:r>
+          </w:p>
+        </w:tc>
+      </w:tr>
+      <w:tr>
+        <w:trPr>
+          <w:trHeight w:val="340"/>
+        </w:trPr>
+        <w:tc>
+          <w:tcPr>
+            <w:tcW w:w="1103" w:type="dxa"/>
+          </w:tcPr>
+          <w:p>
+            <w:pPr>
+              <w:spacing w:line="360" w:lineRule="auto"/>
+            </w:pPr>
+            <w:r>
+              <w:t>10</w:t>
+            </w:r>
+          </w:p>
+        </w:tc>
+        <w:tc>
+          <w:tcPr>
+            <w:tcW w:w="5462" w:type="dxa"/>
+          </w:tcPr>
+          <w:p>
+            <w:pPr>
+              <w:spacing w:line="360" w:lineRule="auto"/>
+            </w:pPr>
+            <w:r>
+              <w:t xml:space="preserve">The </w:t>
+            </w:r>
+            <w:r>
+              <w:t>machine’s clamps were engaged</w:t>
+            </w:r>
+            <w:r>
+              <w:t>.</w:t>
+            </w:r>
+          </w:p>
+        </w:tc>
+        <w:tc>
+          <w:tcPr>
+            <w:tcW w:w="2785" w:type="dxa"/>
+          </w:tcPr>
+          <w:p>
+            <w:pPr>
+              <w:spacing w:line="360" w:lineRule="auto"/>
+            </w:pPr>
+            <w:r>
+              <w:t>None</w:t>
+            </w:r>
+          </w:p>
+        </w:tc>
+      </w:tr>
+      <w:tr>
+        <w:trPr>
+          <w:trHeight w:val="340"/>
+        </w:trPr>
+        <w:tc>
+          <w:tcPr>
+            <w:tcW w:w="1103" w:type="dxa"/>
+          </w:tcPr>
+          <w:p>
+            <w:pPr>
+              <w:spacing w:line="360" w:lineRule="auto"/>
+            </w:pPr>
+            <w:r>
+              <w:t>11</w:t>
+            </w:r>
+          </w:p>
+        </w:tc>
+        <w:tc>
+          <w:tcPr>
+            <w:tcW w:w="5462" w:type="dxa"/>
+          </w:tcPr>
+          <w:p>
+            <w:pPr>
+              <w:spacing w:line="360" w:lineRule="auto"/>
+            </w:pPr>
+            <w:r>
+              <w:t>The machine’s tool was enabled</w:t>
+            </w:r>
+            <w:r>
+              <w:t>.</w:t>
+            </w:r>
+          </w:p>
+        </w:tc>
+        <w:tc>
+          <w:tcPr>
+            <w:tcW w:w="2785" w:type="dxa"/>
+          </w:tcPr>
+          <w:p>
+            <w:pPr>
+              <w:spacing w:line="360" w:lineRule="auto"/>
+            </w:pPr>
+            <w:r>
+              <w:t>None</w:t>
+            </w:r>
+          </w:p>
+        </w:tc>
+      </w:tr>
+      <w:tr>
+        <w:trPr>
+          <w:trHeight w:val="340"/>
+        </w:trPr>
+        <w:tc>
+          <w:tcPr>
+            <w:tcW w:w="1103" w:type="dxa"/>
+          </w:tcPr>
+          <w:p>
+            <w:pPr>
+              <w:spacing w:line="360" w:lineRule="auto"/>
+            </w:pPr>
+            <w:r>
+              <w:t>12</w:t>
+            </w:r>
+          </w:p>
+        </w:tc>
+        <w:tc>
+          <w:tcPr>
+            <w:tcW w:w="5462" w:type="dxa"/>
+          </w:tcPr>
+          <w:p>
+            <w:pPr>
+              <w:spacing w:line="360" w:lineRule="auto"/>
+            </w:pPr>
+            <w:r>
+              <w:t>The machine’s tool at extension sensor was activated</w:t>
+            </w:r>
+            <w:r>
+              <w:t>.</w:t>
+            </w:r>
+          </w:p>
+        </w:tc>
+        <w:tc>
+          <w:tcPr>
+            <w:tcW w:w="2785" w:type="dxa"/>
+          </w:tcPr>
+          <w:p>
+            <w:pPr>
+              <w:spacing w:line="360" w:lineRule="auto"/>
+            </w:pPr>
+            <w:r>
+              <w:t>None</w:t>
+            </w:r>
+          </w:p>
+        </w:tc>
+      </w:tr>
+      <w:tr>
+        <w:trPr>
+          <w:trHeight w:val="340"/>
+        </w:trPr>
+        <w:tc>
+          <w:tcPr>
+            <w:tcW w:w="1103" w:type="dxa"/>
+          </w:tcPr>
+          <w:p>
+            <w:pPr>
+              <w:spacing w:line="360" w:lineRule="auto"/>
+            </w:pPr>
+            <w:r>
+              <w:lastRenderedPageBreak/>
+              <w:t>13</w:t>
+            </w:r>
+          </w:p>
+        </w:tc>
+        <w:tc>
+          <w:tcPr>
+            <w:tcW w:w="5462" w:type="dxa"/>
+          </w:tcPr>
+          <w:p>
+            <w:pPr>
+              <w:spacing w:line="360" w:lineRule="auto"/>
+            </w:pPr>
+            <w:r>
+              <w:t>The machine’s tool at rest sensor was activated</w:t>
+            </w:r>
+            <w:r>
+              <w:t>.</w:t>
+            </w:r>
+          </w:p>
+        </w:tc>
+        <w:tc>
+          <w:tcPr>
+            <w:tcW w:w="2785" w:type="dxa"/>
+          </w:tcPr>
+          <w:p>
+            <w:pPr>
+              <w:spacing w:line="360" w:lineRule="auto"/>
+            </w:pPr>
+            <w:r>
+              <w:t>None</w:t>
+            </w:r>
+          </w:p>
+        </w:tc>
+      </w:tr>
+      <w:tr>
+        <w:trPr>
+          <w:trHeight w:val="340"/>
+        </w:trPr>
+        <w:tc>
+          <w:tcPr>
+            <w:tcW w:w="1103" w:type="dxa"/>
+          </w:tcPr>
+          <w:p>
+            <w:pPr>
+              <w:spacing w:line="360" w:lineRule="auto"/>
+            </w:pPr>
+            <w:r>
+              <w:t>14</w:t>
+            </w:r>
+          </w:p>
+        </w:tc>
+        <w:tc>
+          <w:tcPr>
+            <w:tcW w:w="5462" w:type="dxa"/>
+          </w:tcPr>
+          <w:p>
+            <w:pPr>
+              <w:spacing w:line="360" w:lineRule="auto"/>
+            </w:pPr>
+            <w:r>
+              <w:t>The machine’s tool at rest sensor was deactivated</w:t>
+            </w:r>
+            <w:r>
+              <w:t>.</w:t>
+            </w:r>
+          </w:p>
+        </w:tc>
+        <w:tc>
+          <w:tcPr>
+            <w:tcW w:w="2785" w:type="dxa"/>
+          </w:tcPr>
+          <w:p>
+            <w:pPr>
+              <w:spacing w:line="360" w:lineRule="auto"/>
+            </w:pPr>
+            <w:r>
+              <w:t>None</w:t>
+            </w:r>
+          </w:p>
+        </w:tc>
+      </w:tr>
+      <w:tr>
+        <w:trPr>
+          <w:trHeight w:val="340"/>
+        </w:trPr>
+        <w:tc>
+          <w:tcPr>
+            <w:tcW w:w="1103" w:type="dxa"/>
+          </w:tcPr>
+          <w:p>
+            <w:pPr>
+              <w:spacing w:line="360" w:lineRule="auto"/>
+            </w:pPr>
+            <w:r>
+              <w:t>15</w:t>
+            </w:r>
+          </w:p>
+        </w:tc>
+        <w:tc>
+          <w:tcPr>
+            <w:tcW w:w="5462" w:type="dxa"/>
+          </w:tcPr>
+          <w:p>
+            <w:pPr>
+              <w:spacing w:line="360" w:lineRule="auto"/>
+            </w:pPr>
+            <w:r>
+              <w:t>The machine’s tool at extension sensor was activated</w:t>
+            </w:r>
+            <w:r>
+              <w:t>.</w:t>
+            </w:r>
+          </w:p>
+        </w:tc>
+        <w:tc>
+          <w:tcPr>
+            <w:tcW w:w="2785" w:type="dxa"/>
+          </w:tcPr>
+          <w:p>
+            <w:pPr>
+              <w:spacing w:line="360" w:lineRule="auto"/>
+            </w:pPr>
+            <w:r>
+              <w:t>None</w:t>
+            </w:r>
+          </w:p>
+        </w:tc>
+      </w:tr>
+      <w:tr>
+        <w:trPr>
+          <w:trHeight w:val="340"/>
+        </w:trPr>
+        <w:tc>
+          <w:tcPr>
+            <w:tcW w:w="1103" w:type="dxa"/>
+          </w:tcPr>
+          <w:p>
+            <w:pPr>
+              <w:spacing w:line="360" w:lineRule="auto"/>
+            </w:pPr>
+            <w:r>
+              <w:t>16</w:t>
+            </w:r>
+          </w:p>
+        </w:tc>
+        <w:tc>
+          <w:tcPr>
+            <w:tcW w:w="5462" w:type="dxa"/>
+          </w:tcPr>
+          <w:p>
+            <w:pPr>
+              <w:spacing w:line="360" w:lineRule="auto"/>
+            </w:pPr>
+            <w:r>
+              <w:t>The machine’s clamps were disengaged</w:t>
+            </w:r>
+            <w:r>
+              <w:t>.</w:t>
+            </w:r>
+          </w:p>
+        </w:tc>
+        <w:tc>
+          <w:tcPr>
+            <w:tcW w:w="2785" w:type="dxa"/>
+          </w:tcPr>
+          <w:p>
+            <w:pPr>
+              <w:spacing w:line="360" w:lineRule="auto"/>
+            </w:pPr>
+            <w:r>
+              <w:t>None</w:t>
+            </w:r>
+          </w:p>
+        </w:tc>
+      </w:tr>
+      <w:tr>
+        <w:trPr>
+          <w:trHeight w:val="340"/>
+        </w:trPr>
+        <w:tc>
+          <w:tcPr>
+            <w:tcW w:w="1103" w:type="dxa"/>
+          </w:tcPr>
+          <w:p>
+            <w:pPr>
+              <w:spacing w:line="360" w:lineRule="auto"/>
+            </w:pPr>
+            <w:r>
+              <w:t>17</w:t>
+            </w:r>
+          </w:p>
+        </w:tc>
+        <w:tc>
+          <w:tcPr>
+            <w:tcW w:w="5462" w:type="dxa"/>
+          </w:tcPr>
+          <w:p>
+            <w:pPr>
+              <w:spacing w:line="360" w:lineRule="auto"/>
+            </w:pPr>
+            <w:r>
+              <w:t>The machine completed a full tool cycle</w:t>
+            </w:r>
+            <w:r>
+              <w:t>.</w:t>
+            </w:r>
+          </w:p>
+        </w:tc>
+        <w:tc>
+          <w:tcPr>
+            <w:tcW w:w="2785" w:type="dxa"/>
+          </w:tcPr>
+          <w:p>
+            <w:pPr>
+              <w:spacing w:line="360" w:lineRule="auto"/>
+            </w:pPr>
+            <w:r>
+              <w:t>None</w:t>
+            </w:r>
+          </w:p>
+        </w:tc>
+      </w:tr>
+      <w:tr>
+        <w:trPr>
+          <w:trHeight w:val="340"/>
+        </w:trPr>
+        <w:tc>
+          <w:tcPr>
+            <w:tcW w:w="1103" w:type="dxa"/>
+          </w:tcPr>
+          <w:p>
+            <w:pPr>
+              <w:spacing w:line="360" w:lineRule="auto"/>
+            </w:pPr>
+            <w:r>
+              <w:t>18</w:t>
+            </w:r>
+          </w:p>
+        </w:tc>
+        <w:tc>
+          <w:tcPr>
+            <w:tcW w:w="5462" w:type="dxa"/>
+          </w:tcPr>
+          <w:p>
+            <w:pPr>
+              <w:spacing w:line="360" w:lineRule="auto"/>
+            </w:pPr>
+            <w:r>
+              <w:t>The machine’s tool motor was enabled</w:t>
+            </w:r>
+            <w:r>
+              <w:t>.</w:t>
             </w:r>
           </w:p>
         </w:tc>
@@ -2565,6 +3257,9 @@
             <w:r>
               <w:t>The requested destination is beyond the minimum limit of the machine</w:t>
             </w:r>
+            <w:r>
+              <w:t>.</w:t>
+            </w:r>
           </w:p>
         </w:tc>
       </w:tr>
@@ -2593,6 +3288,9 @@
             <w:r>
               <w:t>The requested destination is beyond the maximum limit of the machine</w:t>
             </w:r>
+            <w:r>
+              <w:t>.</w:t>
+            </w:r>
           </w:p>
         </w:tc>
       </w:tr>
@@ -2621,6 +3319,9 @@
             <w:r>
               <w:t>The positioner was unexpectedly halted during movement</w:t>
             </w:r>
+            <w:r>
+              <w:t>.</w:t>
+            </w:r>
           </w:p>
         </w:tc>
       </w:tr>
@@ -2649,6 +3350,9 @@
             <w:r>
               <w:t>The positioner was unexpectedly moved while at rest</w:t>
             </w:r>
+            <w:r>
+              <w:t>.</w:t>
+            </w:r>
           </w:p>
         </w:tc>
       </w:tr>
@@ -2680,6 +3384,9 @@
             <w:r>
               <w:t>valid number</w:t>
             </w:r>
+            <w:r>
+              <w:t>.</w:t>
+            </w:r>
           </w:p>
         </w:tc>
       </w:tr>
@@ -2708,6 +3415,9 @@
             <w:r>
               <w:t>The requested command is unrecognized</w:t>
             </w:r>
+            <w:r>
+              <w:t>.</w:t>
+            </w:r>
           </w:p>
         </w:tc>
       </w:tr>
@@ -2736,6 +3446,9 @@
             <w:r>
               <w:t>The requested setting is unavailable</w:t>
             </w:r>
+            <w:r>
+              <w:t>.</w:t>
+            </w:r>
           </w:p>
         </w:tc>
       </w:tr>
@@ -2749,7 +3462,6 @@
               <w:spacing w:line="360" w:lineRule="auto"/>
             </w:pPr>
             <w:r>
-              <w:lastRenderedPageBreak/>
               <w:t>108</w:t>
             </w:r>
           </w:p>
@@ -2764,6 +3476,9 @@
             </w:pPr>
             <w:r>
               <w:t>Unable to begin movement due to positioner already being in motion</w:t>
+            </w:r>
+            <w:r>
+              <w:t>.</w:t>
             </w:r>
           </w:p>
         </w:tc>
@@ -2793,6 +3508,9 @@
             <w:r>
               <w:t>The machine is below the voltage threshold for standard operation</w:t>
             </w:r>
+            <w:r>
+              <w:t>.</w:t>
+            </w:r>
           </w:p>
         </w:tc>
       </w:tr>
@@ -2821,6 +3539,9 @@
             <w:r>
               <w:t>The machine is above the voltage threshold for standard operation</w:t>
             </w:r>
+            <w:r>
+              <w:t>.</w:t>
+            </w:r>
           </w:p>
         </w:tc>
       </w:tr>
@@ -2855,6 +3576,9 @@
             <w:r>
               <w:t>operating threshold</w:t>
             </w:r>
+            <w:r>
+              <w:t>.</w:t>
+            </w:r>
           </w:p>
         </w:tc>
       </w:tr>
@@ -2881,7 +3605,16 @@
               <w:spacing w:line="360" w:lineRule="auto"/>
             </w:pPr>
             <w:r>
-              <w:t>The temperature is increasing at an unsafe rate</w:t>
+              <w:t xml:space="preserve">The </w:t>
+            </w:r>
+            <w:r>
+              <w:t xml:space="preserve">amplifier’s </w:t>
+            </w:r>
+            <w:r>
+              <w:t>temperature is increasing at an unsafe rate</w:t>
+            </w:r>
+            <w:r>
+              <w:t>.</w:t>
             </w:r>
           </w:p>
         </w:tc>
@@ -2917,6 +3650,9 @@
             <w:r>
               <w:t xml:space="preserve"> operating threshold</w:t>
             </w:r>
+            <w:r>
+              <w:t>.</w:t>
+            </w:r>
           </w:p>
         </w:tc>
       </w:tr>
@@ -2945,6 +3681,9 @@
             <w:r>
               <w:t>The machine was signaled to stop while moving</w:t>
             </w:r>
+            <w:r>
+              <w:t>.</w:t>
+            </w:r>
           </w:p>
         </w:tc>
       </w:tr>
@@ -2973,6 +3712,9 @@
             <w:r>
               <w:t>A movement was attempted while the tool was engaged</w:t>
             </w:r>
+            <w:r>
+              <w:t>.</w:t>
+            </w:r>
           </w:p>
         </w:tc>
       </w:tr>
@@ -3001,6 +3743,9 @@
             <w:r>
               <w:t>The tool was engaged while the positioner was moving</w:t>
             </w:r>
+            <w:r>
+              <w:t>.</w:t>
+            </w:r>
           </w:p>
         </w:tc>
       </w:tr>
@@ -3031,6 +3776,355 @@
             </w:r>
             <w:r>
               <w:t>number</w:t>
+            </w:r>
+            <w:r>
+              <w:t>.</w:t>
+            </w:r>
+          </w:p>
+        </w:tc>
+      </w:tr>
+      <w:tr>
+        <w:tc>
+          <w:tcPr>
+            <w:tcW w:w="985" w:type="dxa"/>
+          </w:tcPr>
+          <w:p>
+            <w:pPr>
+              <w:spacing w:line="360" w:lineRule="auto"/>
+            </w:pPr>
+            <w:r>
+              <w:t>118</w:t>
+            </w:r>
+          </w:p>
+        </w:tc>
+        <w:tc>
+          <w:tcPr>
+            <w:tcW w:w="8365" w:type="dxa"/>
+          </w:tcPr>
+          <w:p>
+            <w:pPr>
+              <w:spacing w:line="360" w:lineRule="auto"/>
+            </w:pPr>
+            <w:r>
+              <w:t>A tool cycle was attempted, but the machine is missing the proper enable code for Full Auto operation.</w:t>
+            </w:r>
+          </w:p>
+        </w:tc>
+      </w:tr>
+      <w:tr>
+        <w:tc>
+          <w:tcPr>
+            <w:tcW w:w="985" w:type="dxa"/>
+          </w:tcPr>
+          <w:p>
+            <w:pPr>
+              <w:spacing w:line="360" w:lineRule="auto"/>
+            </w:pPr>
+            <w:r>
+              <w:t>119</w:t>
+            </w:r>
+          </w:p>
+        </w:tc>
+        <w:tc>
+          <w:tcPr>
+            <w:tcW w:w="8365" w:type="dxa"/>
+          </w:tcPr>
+          <w:p>
+            <w:pPr>
+              <w:spacing w:line="360" w:lineRule="auto"/>
+            </w:pPr>
+            <w:r>
+              <w:t>A tool cycle was attempted</w:t>
+            </w:r>
+            <w:r>
+              <w:t xml:space="preserve">, but the </w:t>
+            </w:r>
+            <w:r>
+              <w:t xml:space="preserve">machine’s Tool IK setting </w:t>
+            </w:r>
+            <w:r>
+              <w:t xml:space="preserve">is not </w:t>
+            </w:r>
+            <w:r>
+              <w:t>set to ‘Full Auto’</w:t>
+            </w:r>
+            <w:r>
+              <w:t>.</w:t>
+            </w:r>
+          </w:p>
+        </w:tc>
+      </w:tr>
+      <w:tr>
+        <w:tc>
+          <w:tcPr>
+            <w:tcW w:w="985" w:type="dxa"/>
+          </w:tcPr>
+          <w:p>
+            <w:pPr>
+              <w:spacing w:line="360" w:lineRule="auto"/>
+            </w:pPr>
+            <w:r>
+              <w:lastRenderedPageBreak/>
+              <w:t>120</w:t>
+            </w:r>
+          </w:p>
+        </w:tc>
+        <w:tc>
+          <w:tcPr>
+            <w:tcW w:w="8365" w:type="dxa"/>
+          </w:tcPr>
+          <w:p>
+            <w:pPr>
+              <w:spacing w:line="360" w:lineRule="auto"/>
+            </w:pPr>
+            <w:r>
+              <w:t>Either the air sensor was deactivated, or the user attempted a tool cycle while the air sensor was inactive</w:t>
+            </w:r>
+            <w:r>
+              <w:t>.</w:t>
+            </w:r>
+          </w:p>
+        </w:tc>
+      </w:tr>
+      <w:tr>
+        <w:tc>
+          <w:tcPr>
+            <w:tcW w:w="985" w:type="dxa"/>
+          </w:tcPr>
+          <w:p>
+            <w:pPr>
+              <w:spacing w:line="360" w:lineRule="auto"/>
+            </w:pPr>
+            <w:r>
+              <w:t>12</w:t>
+            </w:r>
+            <w:r>
+              <w:t>1</w:t>
+            </w:r>
+          </w:p>
+        </w:tc>
+        <w:tc>
+          <w:tcPr>
+            <w:tcW w:w="8365" w:type="dxa"/>
+          </w:tcPr>
+          <w:p>
+            <w:pPr>
+              <w:spacing w:line="360" w:lineRule="auto"/>
+            </w:pPr>
+            <w:r>
+              <w:t xml:space="preserve">Either the </w:t>
+            </w:r>
+            <w:r>
+              <w:t>oil</w:t>
+            </w:r>
+            <w:r>
+              <w:t xml:space="preserve"> sensor was deactivated, or the user attempted a tool cycle while the </w:t>
+            </w:r>
+            <w:r>
+              <w:t xml:space="preserve">oil </w:t>
+            </w:r>
+            <w:r>
+              <w:t>sensor was inactive</w:t>
+            </w:r>
+            <w:r>
+              <w:t>.</w:t>
+            </w:r>
+          </w:p>
+        </w:tc>
+      </w:tr>
+      <w:tr>
+        <w:tc>
+          <w:tcPr>
+            <w:tcW w:w="985" w:type="dxa"/>
+          </w:tcPr>
+          <w:p>
+            <w:pPr>
+              <w:spacing w:line="360" w:lineRule="auto"/>
+            </w:pPr>
+            <w:r>
+              <w:t>12</w:t>
+            </w:r>
+            <w:r>
+              <w:t>2</w:t>
+            </w:r>
+          </w:p>
+        </w:tc>
+        <w:tc>
+          <w:tcPr>
+            <w:tcW w:w="8365" w:type="dxa"/>
+          </w:tcPr>
+          <w:p>
+            <w:pPr>
+              <w:spacing w:line="360" w:lineRule="auto"/>
+            </w:pPr>
+            <w:r>
+              <w:t xml:space="preserve">Either the </w:t>
+            </w:r>
+            <w:r>
+              <w:t>saw speed</w:t>
+            </w:r>
+            <w:r>
+              <w:t xml:space="preserve"> sensor was deactivated, or the user attempted a tool cycle while the </w:t>
+            </w:r>
+            <w:r>
+              <w:t>saw speed</w:t>
+            </w:r>
+            <w:r>
+              <w:t xml:space="preserve"> sensor was inactive</w:t>
+            </w:r>
+            <w:r>
+              <w:t>.</w:t>
+            </w:r>
+          </w:p>
+        </w:tc>
+      </w:tr>
+      <w:tr>
+        <w:tc>
+          <w:tcPr>
+            <w:tcW w:w="985" w:type="dxa"/>
+          </w:tcPr>
+          <w:p>
+            <w:pPr>
+              <w:spacing w:line="360" w:lineRule="auto"/>
+            </w:pPr>
+            <w:r>
+              <w:t>12</w:t>
+            </w:r>
+            <w:r>
+              <w:t>3</w:t>
+            </w:r>
+          </w:p>
+        </w:tc>
+        <w:tc>
+          <w:tcPr>
+            <w:tcW w:w="8365" w:type="dxa"/>
+          </w:tcPr>
+          <w:p>
+            <w:pPr>
+              <w:spacing w:line="360" w:lineRule="auto"/>
+            </w:pPr>
+            <w:r>
+              <w:t>Either the</w:t>
+            </w:r>
+            <w:r>
+              <w:t xml:space="preserve"> light curtain</w:t>
+            </w:r>
+            <w:r>
+              <w:t xml:space="preserve"> sensor was deactivated, or the user attempted a tool cycle while the</w:t>
+            </w:r>
+            <w:r>
+              <w:t xml:space="preserve"> light curtain</w:t>
+            </w:r>
+            <w:r>
+              <w:t xml:space="preserve"> sensor was inactive</w:t>
+            </w:r>
+            <w:r>
+              <w:t>.</w:t>
+            </w:r>
+          </w:p>
+        </w:tc>
+      </w:tr>
+      <w:tr>
+        <w:tc>
+          <w:tcPr>
+            <w:tcW w:w="985" w:type="dxa"/>
+          </w:tcPr>
+          <w:p>
+            <w:pPr>
+              <w:spacing w:line="360" w:lineRule="auto"/>
+            </w:pPr>
+            <w:r>
+              <w:t>12</w:t>
+            </w:r>
+            <w:r>
+              <w:t>4</w:t>
+            </w:r>
+          </w:p>
+        </w:tc>
+        <w:tc>
+          <w:tcPr>
+            <w:tcW w:w="8365" w:type="dxa"/>
+          </w:tcPr>
+          <w:p>
+            <w:pPr>
+              <w:spacing w:line="360" w:lineRule="auto"/>
+            </w:pPr>
+            <w:r>
+              <w:t xml:space="preserve">Either the </w:t>
+            </w:r>
+            <w:r>
+              <w:t xml:space="preserve">guard door </w:t>
+            </w:r>
+            <w:r>
+              <w:t xml:space="preserve">sensor was deactivated, or the user attempted a tool cycle while the </w:t>
+            </w:r>
+            <w:r>
+              <w:t xml:space="preserve">guard door </w:t>
+            </w:r>
+            <w:r>
+              <w:t>sensor was inactive</w:t>
+            </w:r>
+            <w:r>
+              <w:t>.</w:t>
+            </w:r>
+          </w:p>
+        </w:tc>
+      </w:tr>
+      <w:tr>
+        <w:tc>
+          <w:tcPr>
+            <w:tcW w:w="985" w:type="dxa"/>
+          </w:tcPr>
+          <w:p>
+            <w:pPr>
+              <w:spacing w:line="360" w:lineRule="auto"/>
+            </w:pPr>
+            <w:r>
+              <w:t>125</w:t>
+            </w:r>
+          </w:p>
+        </w:tc>
+        <w:tc>
+          <w:tcPr>
+            <w:tcW w:w="8365" w:type="dxa"/>
+          </w:tcPr>
+          <w:p>
+            <w:pPr>
+              <w:spacing w:line="360" w:lineRule="auto"/>
+            </w:pPr>
+            <w:r>
+              <w:t>The Input/Output panel lost connection</w:t>
+            </w:r>
+            <w:r>
+              <w:t>.</w:t>
+            </w:r>
+          </w:p>
+        </w:tc>
+      </w:tr>
+      <w:tr>
+        <w:tc>
+          <w:tcPr>
+            <w:tcW w:w="985" w:type="dxa"/>
+          </w:tcPr>
+          <w:p>
+            <w:pPr>
+              <w:spacing w:line="360" w:lineRule="auto"/>
+            </w:pPr>
+            <w:r>
+              <w:t>126</w:t>
+            </w:r>
+          </w:p>
+        </w:tc>
+        <w:tc>
+          <w:tcPr>
+            <w:tcW w:w="8365" w:type="dxa"/>
+          </w:tcPr>
+          <w:p>
+            <w:pPr>
+              <w:spacing w:line="360" w:lineRule="auto"/>
+            </w:pPr>
+            <w:r>
+              <w:t>The user attempted to perform a tool cycle while a tool cycle was already in progress.</w:t>
             </w:r>
           </w:p>
         </w:tc>
@@ -3049,11 +4143,31 @@
     </w:p>
     <w:p>
       <w:pPr>
+        <w:rPr>
+          <w:rFonts w:asciiTheme="majorHAnsi" w:eastAsiaTheme="majorEastAsia" w:hAnsiTheme="majorHAnsi" w:cstheme="majorBidi"/>
+          <w:color w:val="0F4761" w:themeColor="accent1" w:themeShade="BF"/>
+          <w:sz w:val="32"/>
+          <w:szCs w:val="32"/>
+        </w:rPr>
+      </w:pPr>
+      <w:r>
+        <w:rPr>
+          <w:rFonts w:asciiTheme="majorHAnsi" w:eastAsiaTheme="majorEastAsia" w:hAnsiTheme="majorHAnsi" w:cstheme="majorBidi"/>
+          <w:color w:val="0F4761" w:themeColor="accent1" w:themeShade="BF"/>
+          <w:sz w:val="32"/>
+          <w:szCs w:val="32"/>
+        </w:rPr>
+        <w:br w:type="page"/>
+      </w:r>
+    </w:p>
+    <w:p>
+      <w:pPr>
         <w:pStyle w:val="Heading2"/>
         <w:spacing w:line="360" w:lineRule="auto"/>
       </w:pPr>
       <w:bookmarkStart w:id="7" w:name="_Toc188363606"/>
       <w:r>
+        <w:lastRenderedPageBreak/>
         <w:t>Functions</w:t>
       </w:r>
       <w:bookmarkEnd w:id="7"/>
@@ -3177,7 +4291,6 @@
       </w:pPr>
       <w:bookmarkStart w:id="9" w:name="_Toc188363608"/>
       <w:r>
-        <w:lastRenderedPageBreak/>
         <w:t>Move To Position Function</w:t>
       </w:r>
       <w:bookmarkEnd w:id="9"/>
@@ -3318,6 +4431,9 @@
       <w:r>
         <w:t>101, 102, 103, 105, 108, 109, 110, 111, 112, 113, 114, 115, 116</w:t>
       </w:r>
+      <w:r>
+        <w:t>, 120, 121, 122, 123, 124</w:t>
+      </w:r>
     </w:p>
     <w:p>
       <w:pPr>
@@ -3326,6 +4442,7 @@
       </w:pPr>
       <w:bookmarkStart w:id="10" w:name="_Toc188363609"/>
       <w:r>
+        <w:lastRenderedPageBreak/>
         <w:t>Get Setting Function</w:t>
       </w:r>
       <w:bookmarkEnd w:id="10"/>
@@ -3535,7 +4652,6 @@
         <w:spacing w:line="360" w:lineRule="auto"/>
       </w:pPr>
       <w:r>
-        <w:lastRenderedPageBreak/>
         <w:t>Setting Value: The value of the requested setting</w:t>
       </w:r>
     </w:p>
@@ -3704,6 +4820,7 @@
       </w:pPr>
       <w:bookmarkStart w:id="12" w:name="_Toc188363611"/>
       <w:r>
+        <w:lastRenderedPageBreak/>
         <w:t>Calibrate Function</w:t>
       </w:r>
       <w:bookmarkEnd w:id="12"/>
@@ -3819,51 +4936,12 @@
       </w:r>
     </w:p>
     <w:p>
-      <w:r>
-        <w:br w:type="page"/>
-      </w:r>
-    </w:p>
-    <w:p>
       <w:pPr>
         <w:pStyle w:val="Heading4"/>
         <w:spacing w:line="360" w:lineRule="auto"/>
       </w:pPr>
       <w:r>
-        <w:lastRenderedPageBreak/>
         <w:t>Response</w:t>
-      </w:r>
-    </w:p>
-    <w:p>
-      <w:pPr>
-        <w:pStyle w:val="ListParagraph"/>
-        <w:numPr>
-          <w:ilvl w:val="0"/>
-          <w:numId w:val="20"/>
-        </w:numPr>
-      </w:pPr>
-      <w:r>
-        <w:t>Message format</w:t>
-      </w:r>
-      <w:r>
-        <w:t>: “6</w:t>
-      </w:r>
-      <w:r>
-        <w:t>\n</w:t>
-      </w:r>
-      <w:r>
-        <w:t>”</w:t>
-      </w:r>
-    </w:p>
-    <w:p>
-      <w:pPr>
-        <w:pStyle w:val="ListParagraph"/>
-        <w:numPr>
-          <w:ilvl w:val="1"/>
-          <w:numId w:val="20"/>
-        </w:numPr>
-      </w:pPr>
-      <w:r>
-        <w:t>Message Code: 6</w:t>
       </w:r>
     </w:p>
     <w:p>
@@ -4024,6 +5102,119 @@
       <w:r>
         <w:t>103, 108, 109, 110, 111, 112, 113, 114, 115, 116</w:t>
       </w:r>
+      <w:r>
+        <w:t>, 120, 121, 122, 123, 124</w:t>
+      </w:r>
+    </w:p>
+    <w:p>
+      <w:r>
+        <w:br w:type="page"/>
+      </w:r>
+    </w:p>
+    <w:p>
+      <w:pPr>
+        <w:pStyle w:val="Heading3"/>
+        <w:spacing w:line="360" w:lineRule="auto"/>
+      </w:pPr>
+      <w:r>
+        <w:lastRenderedPageBreak/>
+        <w:t xml:space="preserve">Cycle Tool </w:t>
+      </w:r>
+      <w:r>
+        <w:t>Function</w:t>
+      </w:r>
+    </w:p>
+    <w:p>
+      <w:r>
+        <w:t>Description TBD</w:t>
+      </w:r>
+    </w:p>
+    <w:p>
+      <w:pPr>
+        <w:pStyle w:val="Heading4"/>
+        <w:spacing w:line="360" w:lineRule="auto"/>
+      </w:pPr>
+      <w:r>
+        <w:t>Request</w:t>
+      </w:r>
+    </w:p>
+    <w:p>
+      <w:pPr>
+        <w:pStyle w:val="ListParagraph"/>
+        <w:numPr>
+          <w:ilvl w:val="0"/>
+          <w:numId w:val="20"/>
+        </w:numPr>
+        <w:spacing w:line="360" w:lineRule="auto"/>
+      </w:pPr>
+      <w:r>
+        <w:t>Identifier: “</w:t>
+      </w:r>
+      <w:proofErr w:type="spellStart"/>
+      <w:r>
+        <w:t>cycle_tool</w:t>
+      </w:r>
+      <w:proofErr w:type="spellEnd"/>
+      <w:r>
+        <w:t>”</w:t>
+      </w:r>
+    </w:p>
+    <w:p>
+      <w:pPr>
+        <w:pStyle w:val="ListParagraph"/>
+        <w:numPr>
+          <w:ilvl w:val="0"/>
+          <w:numId w:val="20"/>
+        </w:numPr>
+        <w:spacing w:line="360" w:lineRule="auto"/>
+      </w:pPr>
+      <w:r>
+        <w:t>Parameters: None</w:t>
+      </w:r>
+    </w:p>
+    <w:p>
+      <w:pPr>
+        <w:pStyle w:val="Heading4"/>
+        <w:spacing w:line="360" w:lineRule="auto"/>
+      </w:pPr>
+      <w:r>
+        <w:t>Response</w:t>
+      </w:r>
+    </w:p>
+    <w:p>
+      <w:pPr>
+        <w:pStyle w:val="ListParagraph"/>
+        <w:numPr>
+          <w:ilvl w:val="0"/>
+          <w:numId w:val="20"/>
+        </w:numPr>
+      </w:pPr>
+      <w:r>
+        <w:t>Possible Error Codes:</w:t>
+      </w:r>
+    </w:p>
+    <w:p>
+      <w:pPr>
+        <w:pStyle w:val="ListParagraph"/>
+        <w:numPr>
+          <w:ilvl w:val="1"/>
+          <w:numId w:val="20"/>
+        </w:numPr>
+      </w:pPr>
+      <w:r>
+        <w:t>114, 116</w:t>
+      </w:r>
+      <w:r>
+        <w:t>, 120, 121, 122, 123, 124</w:t>
+      </w:r>
+      <w:r>
+        <w:t>, 126</w:t>
+      </w:r>
+    </w:p>
+    <w:p>
+      <w:r>
+        <w:br w:type="page"/>
+      </w:r>
     </w:p>
     <w:p>
       <w:pPr>
@@ -4032,6 +5223,7 @@
       </w:pPr>
       <w:bookmarkStart w:id="14" w:name="_Toc188363613"/>
       <w:r>
+        <w:lastRenderedPageBreak/>
         <w:t>Signals</w:t>
       </w:r>
       <w:bookmarkEnd w:id="14"/>
@@ -4109,7 +5301,43 @@
     </w:p>
     <w:p>
       <w:r>
-        <w:t>This signal occurs when a tool connected  via a standard interconnect kit engages.</w:t>
+        <w:t>This signal occurs when</w:t>
+      </w:r>
+      <w:r>
+        <w:t>ever</w:t>
+      </w:r>
+      <w:r>
+        <w:t xml:space="preserve"> a tool</w:t>
+      </w:r>
+      <w:r>
+        <w:t>,</w:t>
+      </w:r>
+      <w:r>
+        <w:t xml:space="preserve"> connected via a </w:t>
+      </w:r>
+      <w:r>
+        <w:t>S</w:t>
+      </w:r>
+      <w:r>
+        <w:t xml:space="preserve">tandard </w:t>
+      </w:r>
+      <w:r>
+        <w:t>I</w:t>
+      </w:r>
+      <w:r>
+        <w:t xml:space="preserve">nterconnect </w:t>
+      </w:r>
+      <w:r>
+        <w:t>K</w:t>
+      </w:r>
+      <w:r>
+        <w:t>it</w:t>
+      </w:r>
+      <w:r>
+        <w:t>,</w:t>
+      </w:r>
+      <w:r>
+        <w:t xml:space="preserve"> engages.</w:t>
       </w:r>
     </w:p>
     <w:p>
@@ -4143,18 +5371,12 @@
       </w:r>
     </w:p>
     <w:p>
-      <w:r>
-        <w:br w:type="page"/>
-      </w:r>
-    </w:p>
-    <w:p>
       <w:pPr>
         <w:pStyle w:val="Heading3"/>
         <w:spacing w:line="360" w:lineRule="auto"/>
       </w:pPr>
       <w:bookmarkStart w:id="17" w:name="_Toc188363616"/>
       <w:r>
-        <w:lastRenderedPageBreak/>
         <w:t>Tool Disengaged Signal</w:t>
       </w:r>
       <w:bookmarkEnd w:id="17"/>
@@ -6472,6 +7694,119 @@
     </w:lvl>
   </w:abstractNum>
   <w:abstractNum w:abstractNumId="21" w15:restartNumberingAfterBreak="0">
+    <w:nsid w:val="792E2A2D"/>
+    <w:multiLevelType w:val="hybridMultilevel"/>
+    <w:tmpl w:val="6AD021AC"/>
+    <w:lvl w:ilvl="0" w:tplc="04090001">
+      <w:start w:val="1"/>
+      <w:numFmt w:val="bullet"/>
+      <w:lvlText w:val=""/>
+      <w:lvlJc w:val="left"/>
+      <w:pPr>
+        <w:ind w:left="720" w:hanging="360"/>
+      </w:pPr>
+      <w:rPr>
+        <w:rFonts w:ascii="Symbol" w:hAnsi="Symbol" w:hint="default"/>
+      </w:rPr>
+    </w:lvl>
+    <w:lvl w:ilvl="1" w:tplc="04090003" w:tentative="1">
+      <w:start w:val="1"/>
+      <w:numFmt w:val="bullet"/>
+      <w:lvlText w:val="o"/>
+      <w:lvlJc w:val="left"/>
+      <w:pPr>
+        <w:ind w:left="1440" w:hanging="360"/>
+      </w:pPr>
+      <w:rPr>
+        <w:rFonts w:ascii="Courier New" w:hAnsi="Courier New" w:cs="Courier New" w:hint="default"/>
+      </w:rPr>
+    </w:lvl>
+    <w:lvl w:ilvl="2" w:tplc="04090005" w:tentative="1">
+      <w:start w:val="1"/>
+      <w:numFmt w:val="bullet"/>
+      <w:lvlText w:val=""/>
+      <w:lvlJc w:val="left"/>
+      <w:pPr>
+        <w:ind w:left="2160" w:hanging="360"/>
+      </w:pPr>
+      <w:rPr>
+        <w:rFonts w:ascii="Wingdings" w:hAnsi="Wingdings" w:hint="default"/>
+      </w:rPr>
+    </w:lvl>
+    <w:lvl w:ilvl="3" w:tplc="04090001" w:tentative="1">
+      <w:start w:val="1"/>
+      <w:numFmt w:val="bullet"/>
+      <w:lvlText w:val=""/>
+      <w:lvlJc w:val="left"/>
+      <w:pPr>
+        <w:ind w:left="2880" w:hanging="360"/>
+      </w:pPr>
+      <w:rPr>
+        <w:rFonts w:ascii="Symbol" w:hAnsi="Symbol" w:hint="default"/>
+      </w:rPr>
+    </w:lvl>
+    <w:lvl w:ilvl="4" w:tplc="04090003" w:tentative="1">
+      <w:start w:val="1"/>
+      <w:numFmt w:val="bullet"/>
+      <w:lvlText w:val="o"/>
+      <w:lvlJc w:val="left"/>
+      <w:pPr>
+        <w:ind w:left="3600" w:hanging="360"/>
+      </w:pPr>
+      <w:rPr>
+        <w:rFonts w:ascii="Courier New" w:hAnsi="Courier New" w:cs="Courier New" w:hint="default"/>
+      </w:rPr>
+    </w:lvl>
+    <w:lvl w:ilvl="5" w:tplc="04090005" w:tentative="1">
+      <w:start w:val="1"/>
+      <w:numFmt w:val="bullet"/>
+      <w:lvlText w:val=""/>
+      <w:lvlJc w:val="left"/>
+      <w:pPr>
+        <w:ind w:left="4320" w:hanging="360"/>
+      </w:pPr>
+      <w:rPr>
+        <w:rFonts w:ascii="Wingdings" w:hAnsi="Wingdings" w:hint="default"/>
+      </w:rPr>
+    </w:lvl>
+    <w:lvl w:ilvl="6" w:tplc="04090001" w:tentative="1">
+      <w:start w:val="1"/>
+      <w:numFmt w:val="bullet"/>
+      <w:lvlText w:val=""/>
+      <w:lvlJc w:val="left"/>
+      <w:pPr>
+        <w:ind w:left="5040" w:hanging="360"/>
+      </w:pPr>
+      <w:rPr>
+        <w:rFonts w:ascii="Symbol" w:hAnsi="Symbol" w:hint="default"/>
+      </w:rPr>
+    </w:lvl>
+    <w:lvl w:ilvl="7" w:tplc="04090003" w:tentative="1">
+      <w:start w:val="1"/>
+      <w:numFmt w:val="bullet"/>
+      <w:lvlText w:val="o"/>
+      <w:lvlJc w:val="left"/>
+      <w:pPr>
+        <w:ind w:left="5760" w:hanging="360"/>
+      </w:pPr>
+      <w:rPr>
+        <w:rFonts w:ascii="Courier New" w:hAnsi="Courier New" w:cs="Courier New" w:hint="default"/>
+      </w:rPr>
+    </w:lvl>
+    <w:lvl w:ilvl="8" w:tplc="04090005" w:tentative="1">
+      <w:start w:val="1"/>
+      <w:numFmt w:val="bullet"/>
+      <w:lvlText w:val=""/>
+      <w:lvlJc w:val="left"/>
+      <w:pPr>
+        <w:ind w:left="6480" w:hanging="360"/>
+      </w:pPr>
+      <w:rPr>
+        <w:rFonts w:ascii="Wingdings" w:hAnsi="Wingdings" w:hint="default"/>
+      </w:rPr>
+    </w:lvl>
+  </w:abstractNum>
+  <w:abstractNum w:abstractNumId="22" w15:restartNumberingAfterBreak="0">
     <w:nsid w:val="7B720C91"/>
     <w:multiLevelType w:val="hybridMultilevel"/>
     <w:tmpl w:val="844826BC"/>
@@ -6584,7 +7919,7 @@
       </w:rPr>
     </w:lvl>
   </w:abstractNum>
-  <w:abstractNum w:abstractNumId="22" w15:restartNumberingAfterBreak="0">
+  <w:abstractNum w:abstractNumId="23" w15:restartNumberingAfterBreak="0">
     <w:nsid w:val="7CC2000A"/>
     <w:multiLevelType w:val="hybridMultilevel"/>
     <w:tmpl w:val="74B4BCC0"/>
@@ -6697,7 +8032,7 @@
       </w:rPr>
     </w:lvl>
   </w:abstractNum>
-  <w:abstractNum w:abstractNumId="23" w15:restartNumberingAfterBreak="0">
+  <w:abstractNum w:abstractNumId="24" w15:restartNumberingAfterBreak="0">
     <w:nsid w:val="7DD80BF3"/>
     <w:multiLevelType w:val="hybridMultilevel"/>
     <w:tmpl w:val="766ED102"/>
@@ -6823,16 +8158,16 @@
     <w:abstractNumId w:val="13"/>
   </w:num>
   <w:num w:numId="5" w16cid:durableId="710691227">
-    <w:abstractNumId w:val="22"/>
+    <w:abstractNumId w:val="23"/>
   </w:num>
   <w:num w:numId="6" w16cid:durableId="1989701543">
     <w:abstractNumId w:val="5"/>
   </w:num>
   <w:num w:numId="7" w16cid:durableId="1632638509">
-    <w:abstractNumId w:val="23"/>
+    <w:abstractNumId w:val="24"/>
   </w:num>
   <w:num w:numId="8" w16cid:durableId="1879656508">
-    <w:abstractNumId w:val="21"/>
+    <w:abstractNumId w:val="22"/>
   </w:num>
   <w:num w:numId="9" w16cid:durableId="314798574">
     <w:abstractNumId w:val="2"/>
@@ -6881,6 +8216,9 @@
   </w:num>
   <w:num w:numId="24" w16cid:durableId="1185901464">
     <w:abstractNumId w:val="0"/>
+  </w:num>
+  <w:num w:numId="25" w16cid:durableId="1268080198">
+    <w:abstractNumId w:val="21"/>
   </w:num>
 </w:numbering>
 </file>

</xml_diff>

<commit_message>
TB 1.2.1.2: Improved documentation
</commit_message>
<xml_diff>
--- a/TigerBridge Documentation.docx
+++ b/TigerBridge Documentation.docx
@@ -1490,11 +1490,19 @@
           <w:rFonts w:cs="Times New Roman"/>
         </w:rPr>
       </w:pPr>
+      <w:proofErr w:type="gramStart"/>
       <w:r>
         <w:rPr>
           <w:rFonts w:cs="Times New Roman"/>
         </w:rPr>
-        <w:t>In order to establish communication with the TigerStop Pro®</w:t>
+        <w:t>In order to</w:t>
+      </w:r>
+      <w:proofErr w:type="gramEnd"/>
+      <w:r>
+        <w:rPr>
+          <w:rFonts w:cs="Times New Roman"/>
+        </w:rPr>
+        <w:t xml:space="preserve"> establish communication with the TigerStop Pro®</w:t>
       </w:r>
       <w:r>
         <w:rPr>
@@ -1655,7 +1663,15 @@
         <w:t xml:space="preserve">Messages sent to the controller </w:t>
       </w:r>
       <w:r>
-        <w:t>should begin with a string matching the requested function and end with a newline character ‘\n’.</w:t>
+        <w:t xml:space="preserve">should begin with a string matching the requested function and end with a newline </w:t>
+      </w:r>
+      <w:proofErr w:type="gramStart"/>
+      <w:r>
+        <w:t>character ‘\</w:t>
+      </w:r>
+      <w:proofErr w:type="gramEnd"/>
+      <w:r>
+        <w:t>n’.</w:t>
       </w:r>
     </w:p>
     <w:p>
@@ -1799,8 +1815,13 @@
               <w:t>“</w:t>
             </w:r>
             <w:proofErr w:type="spellStart"/>
-            <w:r>
-              <w:t>move_to</w:t>
+            <w:proofErr w:type="gramStart"/>
+            <w:r>
+              <w:t>move</w:t>
+            </w:r>
+            <w:proofErr w:type="gramEnd"/>
+            <w:r>
+              <w:t>_to</w:t>
             </w:r>
             <w:proofErr w:type="spellEnd"/>
             <w:r>
@@ -1851,8 +1872,13 @@
               <w:t>“</w:t>
             </w:r>
             <w:proofErr w:type="spellStart"/>
-            <w:r>
-              <w:t>get_setting</w:t>
+            <w:proofErr w:type="gramStart"/>
+            <w:r>
+              <w:t>get</w:t>
+            </w:r>
+            <w:proofErr w:type="gramEnd"/>
+            <w:r>
+              <w:t>_setting</w:t>
             </w:r>
             <w:proofErr w:type="spellEnd"/>
             <w:r>
@@ -1903,8 +1929,13 @@
               <w:t>“</w:t>
             </w:r>
             <w:proofErr w:type="spellStart"/>
-            <w:r>
-              <w:t>get_position</w:t>
+            <w:proofErr w:type="gramStart"/>
+            <w:r>
+              <w:t>get</w:t>
+            </w:r>
+            <w:proofErr w:type="gramEnd"/>
+            <w:r>
+              <w:t>_position</w:t>
             </w:r>
             <w:proofErr w:type="spellEnd"/>
             <w:r>
@@ -2052,8 +2083,13 @@
               <w:t>“</w:t>
             </w:r>
             <w:proofErr w:type="spellStart"/>
-            <w:r>
-              <w:t>cycle_tool</w:t>
+            <w:proofErr w:type="gramStart"/>
+            <w:r>
+              <w:t>cycle</w:t>
+            </w:r>
+            <w:proofErr w:type="gramEnd"/>
+            <w:r>
+              <w:t>_tool</w:t>
             </w:r>
             <w:proofErr w:type="spellEnd"/>
             <w:r>
@@ -2120,7 +2156,15 @@
         <w:t>will begin with a unique integer code that specifies the type of message</w:t>
       </w:r>
       <w:r>
-        <w:t xml:space="preserve"> and end in a newline character ‘\n’.</w:t>
+        <w:t xml:space="preserve"> and end in a newline </w:t>
+      </w:r>
+      <w:proofErr w:type="gramStart"/>
+      <w:r>
+        <w:t>character ‘\</w:t>
+      </w:r>
+      <w:proofErr w:type="gramEnd"/>
+      <w:r>
+        <w:t>n’.</w:t>
       </w:r>
     </w:p>
     <w:p>
@@ -2661,16 +2705,7 @@
               <w:spacing w:line="360" w:lineRule="auto"/>
             </w:pPr>
             <w:r>
-              <w:t xml:space="preserve">The Scanning Pusher Foot’s edge detect sensor was </w:t>
-            </w:r>
-            <w:r>
-              <w:t>de</w:t>
-            </w:r>
-            <w:r>
-              <w:t>activated</w:t>
-            </w:r>
-            <w:r>
-              <w:t>, indicating material is NOT present</w:t>
+              <w:t>The Scanning Pusher Foot’s edge detect sensor was deactivated, indicating material is NOT present</w:t>
             </w:r>
             <w:r>
               <w:t>.</w:t>
@@ -2764,10 +2799,7 @@
               <w:spacing w:line="360" w:lineRule="auto"/>
             </w:pPr>
             <w:r>
-              <w:t xml:space="preserve">The </w:t>
-            </w:r>
-            <w:r>
-              <w:t>machine’s clamps were engaged</w:t>
+              <w:t>The machine’s clamps were engaged</w:t>
             </w:r>
             <w:r>
               <w:t>.</w:t>
@@ -2861,7 +2893,19 @@
               <w:spacing w:line="360" w:lineRule="auto"/>
             </w:pPr>
             <w:r>
-              <w:t>The machine’s tool at extension sensor was activated</w:t>
+              <w:t xml:space="preserve">The machine’s tool at </w:t>
+            </w:r>
+            <w:r>
+              <w:t>rest</w:t>
+            </w:r>
+            <w:r>
+              <w:t xml:space="preserve"> sensor was </w:t>
+            </w:r>
+            <w:r>
+              <w:t>de</w:t>
+            </w:r>
+            <w:r>
+              <w:t>activated</w:t>
             </w:r>
             <w:r>
               <w:t>.</w:t>
@@ -2909,7 +2953,13 @@
               <w:spacing w:line="360" w:lineRule="auto"/>
             </w:pPr>
             <w:r>
-              <w:t>The machine’s tool at rest sensor was activated</w:t>
+              <w:t xml:space="preserve">The machine’s tool at </w:t>
+            </w:r>
+            <w:r>
+              <w:t>extension</w:t>
+            </w:r>
+            <w:r>
+              <w:t xml:space="preserve"> sensor was activated</w:t>
             </w:r>
             <w:r>
               <w:t>.</w:t>
@@ -2956,7 +3006,13 @@
               <w:spacing w:line="360" w:lineRule="auto"/>
             </w:pPr>
             <w:r>
-              <w:t>The machine’s tool at rest sensor was deactivated</w:t>
+              <w:t xml:space="preserve">The machine’s tool at </w:t>
+            </w:r>
+            <w:r>
+              <w:t>extension</w:t>
+            </w:r>
+            <w:r>
+              <w:t xml:space="preserve"> sensor was deactivated</w:t>
             </w:r>
             <w:r>
               <w:t>.</w:t>
@@ -3003,7 +3059,13 @@
               <w:spacing w:line="360" w:lineRule="auto"/>
             </w:pPr>
             <w:r>
-              <w:t>The machine’s tool at extension sensor was activated</w:t>
+              <w:t xml:space="preserve">The machine’s tool at </w:t>
+            </w:r>
+            <w:r>
+              <w:t>rest</w:t>
+            </w:r>
+            <w:r>
+              <w:t xml:space="preserve"> sensor was activated</w:t>
             </w:r>
             <w:r>
               <w:t>.</w:t>
@@ -3144,7 +3206,13 @@
               <w:spacing w:line="360" w:lineRule="auto"/>
             </w:pPr>
             <w:r>
-              <w:t>The machine’s tool motor was enabled</w:t>
+              <w:t xml:space="preserve">The machine’s </w:t>
+            </w:r>
+            <w:r>
+              <w:t>motor</w:t>
+            </w:r>
+            <w:r>
+              <w:t xml:space="preserve"> was enabled</w:t>
             </w:r>
             <w:r>
               <w:t>.</w:t>
@@ -3317,7 +3385,15 @@
               <w:spacing w:line="360" w:lineRule="auto"/>
             </w:pPr>
             <w:r>
-              <w:t>The positioner was unexpectedly halted during movement</w:t>
+              <w:t xml:space="preserve">The </w:t>
+            </w:r>
+            <w:proofErr w:type="gramStart"/>
+            <w:r>
+              <w:t>positioner was</w:t>
+            </w:r>
+            <w:proofErr w:type="gramEnd"/>
+            <w:r>
+              <w:t xml:space="preserve"> unexpectedly halted during movement</w:t>
             </w:r>
             <w:r>
               <w:t>.</w:t>
@@ -3379,7 +3455,15 @@
               <w:spacing w:line="360" w:lineRule="auto"/>
             </w:pPr>
             <w:r>
-              <w:t xml:space="preserve">The requested position value is not a </w:t>
+              <w:t xml:space="preserve">The requested </w:t>
+            </w:r>
+            <w:proofErr w:type="gramStart"/>
+            <w:r>
+              <w:t>position value</w:t>
+            </w:r>
+            <w:proofErr w:type="gramEnd"/>
+            <w:r>
+              <w:t xml:space="preserve"> is not a </w:t>
             </w:r>
             <w:r>
               <w:t>valid number</w:t>
@@ -3821,6 +3905,7 @@
               <w:spacing w:line="360" w:lineRule="auto"/>
             </w:pPr>
             <w:r>
+              <w:lastRenderedPageBreak/>
               <w:t>119</w:t>
             </w:r>
           </w:p>
@@ -3864,7 +3949,6 @@
               <w:spacing w:line="360" w:lineRule="auto"/>
             </w:pPr>
             <w:r>
-              <w:lastRenderedPageBreak/>
               <w:t>120</w:t>
             </w:r>
           </w:p>
@@ -3896,10 +3980,7 @@
               <w:spacing w:line="360" w:lineRule="auto"/>
             </w:pPr>
             <w:r>
-              <w:t>12</w:t>
-            </w:r>
-            <w:r>
-              <w:t>1</w:t>
+              <w:t>121</w:t>
             </w:r>
           </w:p>
         </w:tc>
@@ -3912,19 +3993,7 @@
               <w:spacing w:line="360" w:lineRule="auto"/>
             </w:pPr>
             <w:r>
-              <w:t xml:space="preserve">Either the </w:t>
-            </w:r>
-            <w:r>
-              <w:t>oil</w:t>
-            </w:r>
-            <w:r>
-              <w:t xml:space="preserve"> sensor was deactivated, or the user attempted a tool cycle while the </w:t>
-            </w:r>
-            <w:r>
-              <w:t xml:space="preserve">oil </w:t>
-            </w:r>
-            <w:r>
-              <w:t>sensor was inactive</w:t>
+              <w:t>Either the oil sensor was deactivated, or the user attempted a tool cycle while the oil sensor was inactive</w:t>
             </w:r>
             <w:r>
               <w:t>.</w:t>
@@ -3942,10 +4011,7 @@
               <w:spacing w:line="360" w:lineRule="auto"/>
             </w:pPr>
             <w:r>
-              <w:t>12</w:t>
-            </w:r>
-            <w:r>
-              <w:t>2</w:t>
+              <w:t>122</w:t>
             </w:r>
           </w:p>
         </w:tc>
@@ -3958,19 +4024,7 @@
               <w:spacing w:line="360" w:lineRule="auto"/>
             </w:pPr>
             <w:r>
-              <w:t xml:space="preserve">Either the </w:t>
-            </w:r>
-            <w:r>
-              <w:t>saw speed</w:t>
-            </w:r>
-            <w:r>
-              <w:t xml:space="preserve"> sensor was deactivated, or the user attempted a tool cycle while the </w:t>
-            </w:r>
-            <w:r>
-              <w:t>saw speed</w:t>
-            </w:r>
-            <w:r>
-              <w:t xml:space="preserve"> sensor was inactive</w:t>
+              <w:t>Either the saw speed sensor was deactivated, or the user attempted a tool cycle while the saw speed sensor was inactive</w:t>
             </w:r>
             <w:r>
               <w:t>.</w:t>
@@ -3988,10 +4042,7 @@
               <w:spacing w:line="360" w:lineRule="auto"/>
             </w:pPr>
             <w:r>
-              <w:t>12</w:t>
-            </w:r>
-            <w:r>
-              <w:t>3</w:t>
+              <w:t>123</w:t>
             </w:r>
           </w:p>
         </w:tc>
@@ -4004,19 +4055,7 @@
               <w:spacing w:line="360" w:lineRule="auto"/>
             </w:pPr>
             <w:r>
-              <w:t>Either the</w:t>
-            </w:r>
-            <w:r>
-              <w:t xml:space="preserve"> light curtain</w:t>
-            </w:r>
-            <w:r>
-              <w:t xml:space="preserve"> sensor was deactivated, or the user attempted a tool cycle while the</w:t>
-            </w:r>
-            <w:r>
-              <w:t xml:space="preserve"> light curtain</w:t>
-            </w:r>
-            <w:r>
-              <w:t xml:space="preserve"> sensor was inactive</w:t>
+              <w:t>Either the light curtain sensor was deactivated, or the user attempted a tool cycle while the light curtain sensor was inactive</w:t>
             </w:r>
             <w:r>
               <w:t>.</w:t>
@@ -4034,10 +4073,7 @@
               <w:spacing w:line="360" w:lineRule="auto"/>
             </w:pPr>
             <w:r>
-              <w:t>12</w:t>
-            </w:r>
-            <w:r>
-              <w:t>4</w:t>
+              <w:t>124</w:t>
             </w:r>
           </w:p>
         </w:tc>
@@ -4050,19 +4086,7 @@
               <w:spacing w:line="360" w:lineRule="auto"/>
             </w:pPr>
             <w:r>
-              <w:t xml:space="preserve">Either the </w:t>
-            </w:r>
-            <w:r>
-              <w:t xml:space="preserve">guard door </w:t>
-            </w:r>
-            <w:r>
-              <w:t xml:space="preserve">sensor was deactivated, or the user attempted a tool cycle while the </w:t>
-            </w:r>
-            <w:r>
-              <w:t xml:space="preserve">guard door </w:t>
-            </w:r>
-            <w:r>
-              <w:t>sensor was inactive</w:t>
+              <w:t>Either the guard door sensor was deactivated, or the user attempted a tool cycle while the guard door sensor was inactive</w:t>
             </w:r>
             <w:r>
               <w:t>.</w:t>
@@ -4452,7 +4476,15 @@
         <w:spacing w:line="360" w:lineRule="auto"/>
       </w:pPr>
       <w:r>
-        <w:t xml:space="preserve">There are specific settings from the TigerStop, whose values can be read. </w:t>
+        <w:t xml:space="preserve">There are specific settings from </w:t>
+      </w:r>
+      <w:proofErr w:type="gramStart"/>
+      <w:r>
+        <w:t>the TigerStop</w:t>
+      </w:r>
+      <w:proofErr w:type="gramEnd"/>
+      <w:r>
+        <w:t xml:space="preserve">, whose values can be read. </w:t>
       </w:r>
       <w:r>
         <w:t>The setting name determines which setting to get, and both name and value are sent back upon success.</w:t>
@@ -4607,10 +4639,34 @@
         <w:t xml:space="preserve">ormat: </w:t>
       </w:r>
       <w:r>
-        <w:t>“1|{Setting Name}|{Setting Value}</w:t>
-      </w:r>
-      <w:r>
-        <w:t>\n</w:t>
+        <w:t>“1</w:t>
+      </w:r>
+      <w:proofErr w:type="gramStart"/>
+      <w:r>
+        <w:t>|{</w:t>
+      </w:r>
+      <w:proofErr w:type="gramEnd"/>
+      <w:r>
+        <w:t xml:space="preserve">Setting </w:t>
+      </w:r>
+      <w:proofErr w:type="gramStart"/>
+      <w:r>
+        <w:t>Name}|</w:t>
+      </w:r>
+      <w:proofErr w:type="gramEnd"/>
+      <w:r>
+        <w:t xml:space="preserve">{Setting </w:t>
+      </w:r>
+      <w:proofErr w:type="gramStart"/>
+      <w:r>
+        <w:t>Value}</w:t>
+      </w:r>
+      <w:r>
+        <w:t>\</w:t>
+      </w:r>
+      <w:proofErr w:type="gramEnd"/>
+      <w:r>
+        <w:t>n</w:t>
       </w:r>
       <w:r>
         <w:t>”</w:t>
@@ -5126,7 +5182,106 @@
     </w:p>
     <w:p>
       <w:r>
-        <w:t>Description TBD</w:t>
+        <w:t xml:space="preserve">Initiates a tool cycle sequence. The controller will respond with a message code for each step of the process until the tool cycle is completed or an error prevents completion. A full tool cycle </w:t>
+      </w:r>
+      <w:r>
+        <w:t>is as follows:</w:t>
+      </w:r>
+    </w:p>
+    <w:p>
+      <w:pPr>
+        <w:pStyle w:val="ListParagraph"/>
+        <w:numPr>
+          <w:ilvl w:val="0"/>
+          <w:numId w:val="26"/>
+        </w:numPr>
+      </w:pPr>
+      <w:r>
+        <w:t>Clamps engage: Message code 10</w:t>
+      </w:r>
+    </w:p>
+    <w:p>
+      <w:pPr>
+        <w:pStyle w:val="ListParagraph"/>
+        <w:numPr>
+          <w:ilvl w:val="0"/>
+          <w:numId w:val="26"/>
+        </w:numPr>
+      </w:pPr>
+      <w:r>
+        <w:t>Tool and motor enable signals sent: Message code 11 and message code 18</w:t>
+      </w:r>
+    </w:p>
+    <w:p>
+      <w:pPr>
+        <w:pStyle w:val="ListParagraph"/>
+        <w:numPr>
+          <w:ilvl w:val="0"/>
+          <w:numId w:val="26"/>
+        </w:numPr>
+      </w:pPr>
+      <w:r>
+        <w:t>Tool at rest sensor deactivated: Message code 12</w:t>
+      </w:r>
+    </w:p>
+    <w:p>
+      <w:pPr>
+        <w:pStyle w:val="ListParagraph"/>
+        <w:numPr>
+          <w:ilvl w:val="0"/>
+          <w:numId w:val="26"/>
+        </w:numPr>
+      </w:pPr>
+      <w:r>
+        <w:t>Tool at extension sensor activated: Message code 13</w:t>
+      </w:r>
+    </w:p>
+    <w:p>
+      <w:pPr>
+        <w:pStyle w:val="ListParagraph"/>
+        <w:numPr>
+          <w:ilvl w:val="0"/>
+          <w:numId w:val="26"/>
+        </w:numPr>
+      </w:pPr>
+      <w:r>
+        <w:t>Tool at extension sensor deactivated: Message code 14</w:t>
+      </w:r>
+    </w:p>
+    <w:p>
+      <w:pPr>
+        <w:pStyle w:val="ListParagraph"/>
+        <w:numPr>
+          <w:ilvl w:val="0"/>
+          <w:numId w:val="26"/>
+        </w:numPr>
+      </w:pPr>
+      <w:r>
+        <w:t>Tool at rest sensor activated: Message code 15</w:t>
+      </w:r>
+    </w:p>
+    <w:p>
+      <w:pPr>
+        <w:pStyle w:val="ListParagraph"/>
+        <w:numPr>
+          <w:ilvl w:val="0"/>
+          <w:numId w:val="26"/>
+        </w:numPr>
+      </w:pPr>
+      <w:r>
+        <w:t>Clamps disengaged: Message code 16</w:t>
+      </w:r>
+    </w:p>
+    <w:p>
+      <w:pPr>
+        <w:pStyle w:val="ListParagraph"/>
+        <w:numPr>
+          <w:ilvl w:val="0"/>
+          <w:numId w:val="26"/>
+        </w:numPr>
+      </w:pPr>
+      <w:r>
+        <w:t>Tool cycle complete: Message code 17</w:t>
       </w:r>
     </w:p>
     <w:p>
@@ -5230,7 +5385,15 @@
     </w:p>
     <w:p>
       <w:r>
-        <w:t>Signals are messages that occur during certain operations of the TigerStop. These messages</w:t>
+        <w:t xml:space="preserve">Signals are messages that occur during certain operations of </w:t>
+      </w:r>
+      <w:proofErr w:type="gramStart"/>
+      <w:r>
+        <w:t>the TigerStop</w:t>
+      </w:r>
+      <w:proofErr w:type="gramEnd"/>
+      <w:r>
+        <w:t>. These messages</w:t>
       </w:r>
       <w:r>
         <w:t xml:space="preserve"> may </w:t>
@@ -6621,6 +6784,119 @@
     </w:lvl>
   </w:abstractNum>
   <w:abstractNum w:abstractNumId="11" w15:restartNumberingAfterBreak="0">
+    <w:nsid w:val="2E8B4229"/>
+    <w:multiLevelType w:val="hybridMultilevel"/>
+    <w:tmpl w:val="A3848B6A"/>
+    <w:lvl w:ilvl="0" w:tplc="04090001">
+      <w:start w:val="1"/>
+      <w:numFmt w:val="bullet"/>
+      <w:lvlText w:val=""/>
+      <w:lvlJc w:val="left"/>
+      <w:pPr>
+        <w:ind w:left="720" w:hanging="360"/>
+      </w:pPr>
+      <w:rPr>
+        <w:rFonts w:ascii="Symbol" w:hAnsi="Symbol" w:hint="default"/>
+      </w:rPr>
+    </w:lvl>
+    <w:lvl w:ilvl="1" w:tplc="04090003" w:tentative="1">
+      <w:start w:val="1"/>
+      <w:numFmt w:val="bullet"/>
+      <w:lvlText w:val="o"/>
+      <w:lvlJc w:val="left"/>
+      <w:pPr>
+        <w:ind w:left="1440" w:hanging="360"/>
+      </w:pPr>
+      <w:rPr>
+        <w:rFonts w:ascii="Courier New" w:hAnsi="Courier New" w:cs="Courier New" w:hint="default"/>
+      </w:rPr>
+    </w:lvl>
+    <w:lvl w:ilvl="2" w:tplc="04090005" w:tentative="1">
+      <w:start w:val="1"/>
+      <w:numFmt w:val="bullet"/>
+      <w:lvlText w:val=""/>
+      <w:lvlJc w:val="left"/>
+      <w:pPr>
+        <w:ind w:left="2160" w:hanging="360"/>
+      </w:pPr>
+      <w:rPr>
+        <w:rFonts w:ascii="Wingdings" w:hAnsi="Wingdings" w:hint="default"/>
+      </w:rPr>
+    </w:lvl>
+    <w:lvl w:ilvl="3" w:tplc="04090001" w:tentative="1">
+      <w:start w:val="1"/>
+      <w:numFmt w:val="bullet"/>
+      <w:lvlText w:val=""/>
+      <w:lvlJc w:val="left"/>
+      <w:pPr>
+        <w:ind w:left="2880" w:hanging="360"/>
+      </w:pPr>
+      <w:rPr>
+        <w:rFonts w:ascii="Symbol" w:hAnsi="Symbol" w:hint="default"/>
+      </w:rPr>
+    </w:lvl>
+    <w:lvl w:ilvl="4" w:tplc="04090003" w:tentative="1">
+      <w:start w:val="1"/>
+      <w:numFmt w:val="bullet"/>
+      <w:lvlText w:val="o"/>
+      <w:lvlJc w:val="left"/>
+      <w:pPr>
+        <w:ind w:left="3600" w:hanging="360"/>
+      </w:pPr>
+      <w:rPr>
+        <w:rFonts w:ascii="Courier New" w:hAnsi="Courier New" w:cs="Courier New" w:hint="default"/>
+      </w:rPr>
+    </w:lvl>
+    <w:lvl w:ilvl="5" w:tplc="04090005" w:tentative="1">
+      <w:start w:val="1"/>
+      <w:numFmt w:val="bullet"/>
+      <w:lvlText w:val=""/>
+      <w:lvlJc w:val="left"/>
+      <w:pPr>
+        <w:ind w:left="4320" w:hanging="360"/>
+      </w:pPr>
+      <w:rPr>
+        <w:rFonts w:ascii="Wingdings" w:hAnsi="Wingdings" w:hint="default"/>
+      </w:rPr>
+    </w:lvl>
+    <w:lvl w:ilvl="6" w:tplc="04090001" w:tentative="1">
+      <w:start w:val="1"/>
+      <w:numFmt w:val="bullet"/>
+      <w:lvlText w:val=""/>
+      <w:lvlJc w:val="left"/>
+      <w:pPr>
+        <w:ind w:left="5040" w:hanging="360"/>
+      </w:pPr>
+      <w:rPr>
+        <w:rFonts w:ascii="Symbol" w:hAnsi="Symbol" w:hint="default"/>
+      </w:rPr>
+    </w:lvl>
+    <w:lvl w:ilvl="7" w:tplc="04090003" w:tentative="1">
+      <w:start w:val="1"/>
+      <w:numFmt w:val="bullet"/>
+      <w:lvlText w:val="o"/>
+      <w:lvlJc w:val="left"/>
+      <w:pPr>
+        <w:ind w:left="5760" w:hanging="360"/>
+      </w:pPr>
+      <w:rPr>
+        <w:rFonts w:ascii="Courier New" w:hAnsi="Courier New" w:cs="Courier New" w:hint="default"/>
+      </w:rPr>
+    </w:lvl>
+    <w:lvl w:ilvl="8" w:tplc="04090005" w:tentative="1">
+      <w:start w:val="1"/>
+      <w:numFmt w:val="bullet"/>
+      <w:lvlText w:val=""/>
+      <w:lvlJc w:val="left"/>
+      <w:pPr>
+        <w:ind w:left="6480" w:hanging="360"/>
+      </w:pPr>
+      <w:rPr>
+        <w:rFonts w:ascii="Wingdings" w:hAnsi="Wingdings" w:hint="default"/>
+      </w:rPr>
+    </w:lvl>
+  </w:abstractNum>
+  <w:abstractNum w:abstractNumId="12" w15:restartNumberingAfterBreak="0">
     <w:nsid w:val="34317F32"/>
     <w:multiLevelType w:val="hybridMultilevel"/>
     <w:tmpl w:val="D408AE06"/>
@@ -6733,7 +7009,7 @@
       </w:rPr>
     </w:lvl>
   </w:abstractNum>
-  <w:abstractNum w:abstractNumId="12" w15:restartNumberingAfterBreak="0">
+  <w:abstractNum w:abstractNumId="13" w15:restartNumberingAfterBreak="0">
     <w:nsid w:val="4EEC04F3"/>
     <w:multiLevelType w:val="hybridMultilevel"/>
     <w:tmpl w:val="6AF01A08"/>
@@ -6845,7 +7121,7 @@
       </w:rPr>
     </w:lvl>
   </w:abstractNum>
-  <w:abstractNum w:abstractNumId="13" w15:restartNumberingAfterBreak="0">
+  <w:abstractNum w:abstractNumId="14" w15:restartNumberingAfterBreak="0">
     <w:nsid w:val="4FF952C0"/>
     <w:multiLevelType w:val="hybridMultilevel"/>
     <w:tmpl w:val="AE4ADBB0"/>
@@ -6958,7 +7234,7 @@
       </w:rPr>
     </w:lvl>
   </w:abstractNum>
-  <w:abstractNum w:abstractNumId="14" w15:restartNumberingAfterBreak="0">
+  <w:abstractNum w:abstractNumId="15" w15:restartNumberingAfterBreak="0">
     <w:nsid w:val="501A49C1"/>
     <w:multiLevelType w:val="hybridMultilevel"/>
     <w:tmpl w:val="7FDA7604"/>
@@ -7070,7 +7346,7 @@
       </w:rPr>
     </w:lvl>
   </w:abstractNum>
-  <w:abstractNum w:abstractNumId="15" w15:restartNumberingAfterBreak="0">
+  <w:abstractNum w:abstractNumId="16" w15:restartNumberingAfterBreak="0">
     <w:nsid w:val="575476B9"/>
     <w:multiLevelType w:val="hybridMultilevel"/>
     <w:tmpl w:val="61045436"/>
@@ -7156,7 +7432,7 @@
       </w:pPr>
     </w:lvl>
   </w:abstractNum>
-  <w:abstractNum w:abstractNumId="16" w15:restartNumberingAfterBreak="0">
+  <w:abstractNum w:abstractNumId="17" w15:restartNumberingAfterBreak="0">
     <w:nsid w:val="594A34C5"/>
     <w:multiLevelType w:val="hybridMultilevel"/>
     <w:tmpl w:val="61045436"/>
@@ -7242,7 +7518,7 @@
       </w:pPr>
     </w:lvl>
   </w:abstractNum>
-  <w:abstractNum w:abstractNumId="17" w15:restartNumberingAfterBreak="0">
+  <w:abstractNum w:abstractNumId="18" w15:restartNumberingAfterBreak="0">
     <w:nsid w:val="5E6D429D"/>
     <w:multiLevelType w:val="hybridMultilevel"/>
     <w:tmpl w:val="852A1998"/>
@@ -7355,7 +7631,7 @@
       </w:rPr>
     </w:lvl>
   </w:abstractNum>
-  <w:abstractNum w:abstractNumId="18" w15:restartNumberingAfterBreak="0">
+  <w:abstractNum w:abstractNumId="19" w15:restartNumberingAfterBreak="0">
     <w:nsid w:val="69930746"/>
     <w:multiLevelType w:val="hybridMultilevel"/>
     <w:tmpl w:val="5EFA3358"/>
@@ -7467,7 +7743,7 @@
       </w:rPr>
     </w:lvl>
   </w:abstractNum>
-  <w:abstractNum w:abstractNumId="19" w15:restartNumberingAfterBreak="0">
+  <w:abstractNum w:abstractNumId="20" w15:restartNumberingAfterBreak="0">
     <w:nsid w:val="72434EB0"/>
     <w:multiLevelType w:val="hybridMultilevel"/>
     <w:tmpl w:val="096CE47A"/>
@@ -7580,7 +7856,7 @@
       </w:rPr>
     </w:lvl>
   </w:abstractNum>
-  <w:abstractNum w:abstractNumId="20" w15:restartNumberingAfterBreak="0">
+  <w:abstractNum w:abstractNumId="21" w15:restartNumberingAfterBreak="0">
     <w:nsid w:val="75E5354E"/>
     <w:multiLevelType w:val="hybridMultilevel"/>
     <w:tmpl w:val="5ACA6336"/>
@@ -7693,7 +7969,7 @@
       </w:rPr>
     </w:lvl>
   </w:abstractNum>
-  <w:abstractNum w:abstractNumId="21" w15:restartNumberingAfterBreak="0">
+  <w:abstractNum w:abstractNumId="22" w15:restartNumberingAfterBreak="0">
     <w:nsid w:val="792E2A2D"/>
     <w:multiLevelType w:val="hybridMultilevel"/>
     <w:tmpl w:val="6AD021AC"/>
@@ -7806,7 +8082,7 @@
       </w:rPr>
     </w:lvl>
   </w:abstractNum>
-  <w:abstractNum w:abstractNumId="22" w15:restartNumberingAfterBreak="0">
+  <w:abstractNum w:abstractNumId="23" w15:restartNumberingAfterBreak="0">
     <w:nsid w:val="7B720C91"/>
     <w:multiLevelType w:val="hybridMultilevel"/>
     <w:tmpl w:val="844826BC"/>
@@ -7919,7 +8195,7 @@
       </w:rPr>
     </w:lvl>
   </w:abstractNum>
-  <w:abstractNum w:abstractNumId="23" w15:restartNumberingAfterBreak="0">
+  <w:abstractNum w:abstractNumId="24" w15:restartNumberingAfterBreak="0">
     <w:nsid w:val="7CC2000A"/>
     <w:multiLevelType w:val="hybridMultilevel"/>
     <w:tmpl w:val="74B4BCC0"/>
@@ -8032,7 +8308,7 @@
       </w:rPr>
     </w:lvl>
   </w:abstractNum>
-  <w:abstractNum w:abstractNumId="24" w15:restartNumberingAfterBreak="0">
+  <w:abstractNum w:abstractNumId="25" w15:restartNumberingAfterBreak="0">
     <w:nsid w:val="7DD80BF3"/>
     <w:multiLevelType w:val="hybridMultilevel"/>
     <w:tmpl w:val="766ED102"/>
@@ -8146,28 +8422,28 @@
     </w:lvl>
   </w:abstractNum>
   <w:num w:numId="1" w16cid:durableId="2112623098">
+    <w:abstractNumId w:val="17"/>
+  </w:num>
+  <w:num w:numId="2" w16cid:durableId="1912694526">
     <w:abstractNumId w:val="16"/>
   </w:num>
-  <w:num w:numId="2" w16cid:durableId="1912694526">
-    <w:abstractNumId w:val="15"/>
-  </w:num>
   <w:num w:numId="3" w16cid:durableId="1622492544">
-    <w:abstractNumId w:val="20"/>
+    <w:abstractNumId w:val="21"/>
   </w:num>
   <w:num w:numId="4" w16cid:durableId="690031347">
-    <w:abstractNumId w:val="13"/>
+    <w:abstractNumId w:val="14"/>
   </w:num>
   <w:num w:numId="5" w16cid:durableId="710691227">
-    <w:abstractNumId w:val="23"/>
+    <w:abstractNumId w:val="24"/>
   </w:num>
   <w:num w:numId="6" w16cid:durableId="1989701543">
     <w:abstractNumId w:val="5"/>
   </w:num>
   <w:num w:numId="7" w16cid:durableId="1632638509">
-    <w:abstractNumId w:val="24"/>
+    <w:abstractNumId w:val="25"/>
   </w:num>
   <w:num w:numId="8" w16cid:durableId="1879656508">
-    <w:abstractNumId w:val="22"/>
+    <w:abstractNumId w:val="23"/>
   </w:num>
   <w:num w:numId="9" w16cid:durableId="314798574">
     <w:abstractNumId w:val="2"/>
@@ -8179,7 +8455,7 @@
     <w:abstractNumId w:val="9"/>
   </w:num>
   <w:num w:numId="12" w16cid:durableId="854004802">
-    <w:abstractNumId w:val="17"/>
+    <w:abstractNumId w:val="18"/>
   </w:num>
   <w:num w:numId="13" w16cid:durableId="698510210">
     <w:abstractNumId w:val="10"/>
@@ -8188,7 +8464,7 @@
     <w:abstractNumId w:val="1"/>
   </w:num>
   <w:num w:numId="15" w16cid:durableId="602542954">
-    <w:abstractNumId w:val="19"/>
+    <w:abstractNumId w:val="20"/>
   </w:num>
   <w:num w:numId="16" w16cid:durableId="1324889235">
     <w:abstractNumId w:val="7"/>
@@ -8197,13 +8473,13 @@
     <w:abstractNumId w:val="8"/>
   </w:num>
   <w:num w:numId="18" w16cid:durableId="1799685107">
-    <w:abstractNumId w:val="12"/>
+    <w:abstractNumId w:val="13"/>
   </w:num>
   <w:num w:numId="19" w16cid:durableId="955062679">
-    <w:abstractNumId w:val="14"/>
+    <w:abstractNumId w:val="15"/>
   </w:num>
   <w:num w:numId="20" w16cid:durableId="813177555">
-    <w:abstractNumId w:val="18"/>
+    <w:abstractNumId w:val="19"/>
   </w:num>
   <w:num w:numId="21" w16cid:durableId="818961189">
     <w:abstractNumId w:val="6"/>
@@ -8212,13 +8488,16 @@
     <w:abstractNumId w:val="4"/>
   </w:num>
   <w:num w:numId="23" w16cid:durableId="1507213483">
-    <w:abstractNumId w:val="11"/>
+    <w:abstractNumId w:val="12"/>
   </w:num>
   <w:num w:numId="24" w16cid:durableId="1185901464">
     <w:abstractNumId w:val="0"/>
   </w:num>
   <w:num w:numId="25" w16cid:durableId="1268080198">
-    <w:abstractNumId w:val="21"/>
+    <w:abstractNumId w:val="22"/>
+  </w:num>
+  <w:num w:numId="26" w16cid:durableId="1210653735">
+    <w:abstractNumId w:val="11"/>
   </w:num>
 </w:numbering>
 </file>

</xml_diff>

<commit_message>
TB 1.2.2.1: Added a units setting
Units can be set to millimeters or inches.
Systems on previous versions will function the same, as this setting defaults to millimeters.
</commit_message>
<xml_diff>
--- a/TigerBridge Documentation.docx
+++ b/TigerBridge Documentation.docx
@@ -41,7 +41,6 @@
           <w:rFonts w:asciiTheme="minorHAnsi" w:hAnsiTheme="minorHAnsi" w:cs="Times New Roman"/>
         </w:rPr>
       </w:pPr>
-      <w:proofErr w:type="spellStart"/>
       <w:r>
         <w:rPr>
           <w:rFonts w:asciiTheme="minorHAnsi" w:hAnsiTheme="minorHAnsi" w:cs="Times New Roman"/>
@@ -54,7 +53,6 @@
         </w:rPr>
         <w:t>Bridge</w:t>
       </w:r>
-      <w:proofErr w:type="spellEnd"/>
     </w:p>
     <w:p>
       <w:pPr>
@@ -1477,7 +1475,6 @@
         <w:rPr>
           <w:rFonts w:asciiTheme="minorHAnsi" w:hAnsiTheme="minorHAnsi" w:cs="Times New Roman"/>
         </w:rPr>
-        <w:lastRenderedPageBreak/>
         <w:t>Establishing Communication</w:t>
       </w:r>
       <w:bookmarkEnd w:id="0"/>
@@ -1490,19 +1487,11 @@
           <w:rFonts w:cs="Times New Roman"/>
         </w:rPr>
       </w:pPr>
-      <w:proofErr w:type="gramStart"/>
       <w:r>
         <w:rPr>
           <w:rFonts w:cs="Times New Roman"/>
         </w:rPr>
-        <w:t>In order to</w:t>
-      </w:r>
-      <w:proofErr w:type="gramEnd"/>
-      <w:r>
-        <w:rPr>
-          <w:rFonts w:cs="Times New Roman"/>
-        </w:rPr>
-        <w:t xml:space="preserve"> establish communication with the TigerStop Pro®</w:t>
+        <w:t>In order to establish communication with the TigerStop Pro®</w:t>
       </w:r>
       <w:r>
         <w:rPr>
@@ -1663,15 +1652,7 @@
         <w:t xml:space="preserve">Messages sent to the controller </w:t>
       </w:r>
       <w:r>
-        <w:t xml:space="preserve">should begin with a string matching the requested function and end with a newline </w:t>
-      </w:r>
-      <w:proofErr w:type="gramStart"/>
-      <w:r>
-        <w:t>character ‘\</w:t>
-      </w:r>
-      <w:proofErr w:type="gramEnd"/>
-      <w:r>
-        <w:t>n’.</w:t>
+        <w:t>should begin with a string matching the requested function and end with a newline character ‘\n’.</w:t>
       </w:r>
     </w:p>
     <w:p>
@@ -1812,20 +1793,7 @@
               <w:spacing w:line="360" w:lineRule="auto"/>
             </w:pPr>
             <w:r>
-              <w:t>“</w:t>
-            </w:r>
-            <w:proofErr w:type="spellStart"/>
-            <w:proofErr w:type="gramStart"/>
-            <w:r>
-              <w:t>move</w:t>
-            </w:r>
-            <w:proofErr w:type="gramEnd"/>
-            <w:r>
-              <w:t>_to</w:t>
-            </w:r>
-            <w:proofErr w:type="spellEnd"/>
-            <w:r>
-              <w:t>”</w:t>
+              <w:t>“move_to”</w:t>
             </w:r>
           </w:p>
         </w:tc>
@@ -1869,20 +1837,7 @@
               <w:spacing w:line="360" w:lineRule="auto"/>
             </w:pPr>
             <w:r>
-              <w:t>“</w:t>
-            </w:r>
-            <w:proofErr w:type="spellStart"/>
-            <w:proofErr w:type="gramStart"/>
-            <w:r>
-              <w:t>get</w:t>
-            </w:r>
-            <w:proofErr w:type="gramEnd"/>
-            <w:r>
-              <w:t>_setting</w:t>
-            </w:r>
-            <w:proofErr w:type="spellEnd"/>
-            <w:r>
-              <w:t>”</w:t>
+              <w:t>“get_setting”</w:t>
             </w:r>
           </w:p>
         </w:tc>
@@ -1926,20 +1881,7 @@
               <w:spacing w:line="360" w:lineRule="auto"/>
             </w:pPr>
             <w:r>
-              <w:t>“</w:t>
-            </w:r>
-            <w:proofErr w:type="spellStart"/>
-            <w:proofErr w:type="gramStart"/>
-            <w:r>
-              <w:t>get</w:t>
-            </w:r>
-            <w:proofErr w:type="gramEnd"/>
-            <w:r>
-              <w:t>_position</w:t>
-            </w:r>
-            <w:proofErr w:type="spellEnd"/>
-            <w:r>
-              <w:t>”</w:t>
+              <w:t>“set_units”</w:t>
             </w:r>
           </w:p>
         </w:tc>
@@ -1952,10 +1894,13 @@
               <w:spacing w:line="360" w:lineRule="auto"/>
             </w:pPr>
             <w:r>
-              <w:t>Requests the current position of the positioner</w:t>
-            </w:r>
-            <w:r>
-              <w:t>.</w:t>
+              <w:t>Requests for the controller to send and receive positional</w:t>
+            </w:r>
+            <w:r>
+              <w:t xml:space="preserve"> data</w:t>
+            </w:r>
+            <w:r>
+              <w:t xml:space="preserve"> with a specified unit.</w:t>
             </w:r>
           </w:p>
         </w:tc>
@@ -1968,7 +1913,7 @@
               <w:spacing w:line="360" w:lineRule="auto"/>
             </w:pPr>
             <w:r>
-              <w:t>None</w:t>
+              <w:t>Unit Type</w:t>
             </w:r>
           </w:p>
         </w:tc>
@@ -1983,10 +1928,7 @@
               <w:spacing w:line="360" w:lineRule="auto"/>
             </w:pPr>
             <w:r>
-              <w:t>“calibrate</w:t>
-            </w:r>
-            <w:r>
-              <w:t>”</w:t>
+              <w:t>“get_position”</w:t>
             </w:r>
           </w:p>
         </w:tc>
@@ -1999,13 +1941,7 @@
               <w:spacing w:line="360" w:lineRule="auto"/>
             </w:pPr>
             <w:r>
-              <w:t>Sets the positioner</w:t>
-            </w:r>
-            <w:r>
-              <w:t>’</w:t>
-            </w:r>
-            <w:r>
-              <w:t>s position in relation to the tool</w:t>
+              <w:t>Requests the current position of the positioner</w:t>
             </w:r>
             <w:r>
               <w:t>.</w:t>
@@ -2021,7 +1957,7 @@
               <w:spacing w:line="360" w:lineRule="auto"/>
             </w:pPr>
             <w:r>
-              <w:t>Position</w:t>
+              <w:t>None</w:t>
             </w:r>
           </w:p>
         </w:tc>
@@ -2036,7 +1972,10 @@
               <w:spacing w:line="360" w:lineRule="auto"/>
             </w:pPr>
             <w:r>
-              <w:t>“home”</w:t>
+              <w:t>“calibrate</w:t>
+            </w:r>
+            <w:r>
+              <w:t>”</w:t>
             </w:r>
           </w:p>
         </w:tc>
@@ -2049,7 +1988,13 @@
               <w:spacing w:line="360" w:lineRule="auto"/>
             </w:pPr>
             <w:r>
-              <w:t>Sends the positioner to the far end of the beam (relative to the tool), allowing for a consistent reference point for positioning</w:t>
+              <w:t>Sets the positioner</w:t>
+            </w:r>
+            <w:r>
+              <w:t>’</w:t>
+            </w:r>
+            <w:r>
+              <w:t>s position in relation to the tool</w:t>
             </w:r>
             <w:r>
               <w:t>.</w:t>
@@ -2065,7 +2010,7 @@
               <w:spacing w:line="360" w:lineRule="auto"/>
             </w:pPr>
             <w:r>
-              <w:t>None</w:t>
+              <w:t>Position</w:t>
             </w:r>
           </w:p>
         </w:tc>
@@ -2080,20 +2025,51 @@
               <w:spacing w:line="360" w:lineRule="auto"/>
             </w:pPr>
             <w:r>
-              <w:t>“</w:t>
-            </w:r>
-            <w:proofErr w:type="spellStart"/>
-            <w:proofErr w:type="gramStart"/>
-            <w:r>
-              <w:t>cycle</w:t>
-            </w:r>
-            <w:proofErr w:type="gramEnd"/>
-            <w:r>
-              <w:t>_tool</w:t>
-            </w:r>
-            <w:proofErr w:type="spellEnd"/>
-            <w:r>
-              <w:t>”</w:t>
+              <w:t>“home”</w:t>
+            </w:r>
+          </w:p>
+        </w:tc>
+        <w:tc>
+          <w:tcPr>
+            <w:tcW w:w="5310" w:type="dxa"/>
+          </w:tcPr>
+          <w:p>
+            <w:pPr>
+              <w:spacing w:line="360" w:lineRule="auto"/>
+            </w:pPr>
+            <w:r>
+              <w:t>Sends the positioner to the far end of the beam (relative to the tool), allowing for a consistent reference point for positioning</w:t>
+            </w:r>
+            <w:r>
+              <w:t>.</w:t>
+            </w:r>
+          </w:p>
+        </w:tc>
+        <w:tc>
+          <w:tcPr>
+            <w:tcW w:w="1975" w:type="dxa"/>
+          </w:tcPr>
+          <w:p>
+            <w:pPr>
+              <w:spacing w:line="360" w:lineRule="auto"/>
+            </w:pPr>
+            <w:r>
+              <w:t>None</w:t>
+            </w:r>
+          </w:p>
+        </w:tc>
+      </w:tr>
+      <w:tr>
+        <w:tc>
+          <w:tcPr>
+            <w:tcW w:w="2065" w:type="dxa"/>
+          </w:tcPr>
+          <w:p>
+            <w:pPr>
+              <w:spacing w:line="360" w:lineRule="auto"/>
+            </w:pPr>
+            <w:r>
+              <w:t>“cycle_tool”</w:t>
             </w:r>
           </w:p>
         </w:tc>
@@ -2137,7 +2113,6 @@
       </w:pPr>
       <w:bookmarkStart w:id="4" w:name="_Toc188363603"/>
       <w:r>
-        <w:lastRenderedPageBreak/>
         <w:t>Receiving Messages</w:t>
       </w:r>
       <w:bookmarkEnd w:id="4"/>
@@ -2156,15 +2131,7 @@
         <w:t>will begin with a unique integer code that specifies the type of message</w:t>
       </w:r>
       <w:r>
-        <w:t xml:space="preserve"> and end in a newline </w:t>
-      </w:r>
-      <w:proofErr w:type="gramStart"/>
-      <w:r>
-        <w:t>character ‘\</w:t>
-      </w:r>
-      <w:proofErr w:type="gramEnd"/>
-      <w:r>
-        <w:t>n’.</w:t>
+        <w:t xml:space="preserve"> and end in a newline character ‘\n’.</w:t>
       </w:r>
     </w:p>
     <w:p>
@@ -2939,7 +2906,6 @@
               <w:spacing w:line="360" w:lineRule="auto"/>
             </w:pPr>
             <w:r>
-              <w:lastRenderedPageBreak/>
               <w:t>13</w:t>
             </w:r>
           </w:p>
@@ -3216,6 +3182,50 @@
             </w:r>
             <w:r>
               <w:t>.</w:t>
+            </w:r>
+          </w:p>
+        </w:tc>
+        <w:tc>
+          <w:tcPr>
+            <w:tcW w:w="2785" w:type="dxa"/>
+          </w:tcPr>
+          <w:p>
+            <w:pPr>
+              <w:spacing w:line="360" w:lineRule="auto"/>
+            </w:pPr>
+            <w:r>
+              <w:t>None</w:t>
+            </w:r>
+          </w:p>
+        </w:tc>
+      </w:tr>
+      <w:tr>
+        <w:trPr>
+          <w:trHeight w:val="340"/>
+        </w:trPr>
+        <w:tc>
+          <w:tcPr>
+            <w:tcW w:w="1103" w:type="dxa"/>
+          </w:tcPr>
+          <w:p>
+            <w:pPr>
+              <w:spacing w:line="360" w:lineRule="auto"/>
+            </w:pPr>
+            <w:r>
+              <w:t>19</w:t>
+            </w:r>
+          </w:p>
+        </w:tc>
+        <w:tc>
+          <w:tcPr>
+            <w:tcW w:w="5462" w:type="dxa"/>
+          </w:tcPr>
+          <w:p>
+            <w:pPr>
+              <w:spacing w:line="360" w:lineRule="auto"/>
+            </w:pPr>
+            <w:r>
+              <w:t>Units were set successfully</w:t>
             </w:r>
           </w:p>
         </w:tc>
@@ -3385,15 +3395,7 @@
               <w:spacing w:line="360" w:lineRule="auto"/>
             </w:pPr>
             <w:r>
-              <w:t xml:space="preserve">The </w:t>
-            </w:r>
-            <w:proofErr w:type="gramStart"/>
-            <w:r>
-              <w:t>positioner was</w:t>
-            </w:r>
-            <w:proofErr w:type="gramEnd"/>
-            <w:r>
-              <w:t xml:space="preserve"> unexpectedly halted during movement</w:t>
+              <w:t>The positioner was unexpectedly halted during movement</w:t>
             </w:r>
             <w:r>
               <w:t>.</w:t>
@@ -3455,15 +3457,7 @@
               <w:spacing w:line="360" w:lineRule="auto"/>
             </w:pPr>
             <w:r>
-              <w:t xml:space="preserve">The requested </w:t>
-            </w:r>
-            <w:proofErr w:type="gramStart"/>
-            <w:r>
-              <w:t>position value</w:t>
-            </w:r>
-            <w:proofErr w:type="gramEnd"/>
-            <w:r>
-              <w:t xml:space="preserve"> is not a </w:t>
+              <w:t xml:space="preserve">The requested position value is not a </w:t>
             </w:r>
             <w:r>
               <w:t>valid number</w:t>
@@ -3905,7 +3899,6 @@
               <w:spacing w:line="360" w:lineRule="auto"/>
             </w:pPr>
             <w:r>
-              <w:lastRenderedPageBreak/>
               <w:t>119</w:t>
             </w:r>
           </w:p>
@@ -4191,7 +4184,6 @@
       </w:pPr>
       <w:bookmarkStart w:id="7" w:name="_Toc188363606"/>
       <w:r>
-        <w:lastRenderedPageBreak/>
         <w:t>Functions</w:t>
       </w:r>
       <w:bookmarkEnd w:id="7"/>
@@ -4307,6 +4299,9 @@
       <w:r>
         <w:t>114</w:t>
       </w:r>
+      <w:r>
+        <w:t xml:space="preserve"> (always sent)</w:t>
+      </w:r>
     </w:p>
     <w:p>
       <w:pPr>
@@ -4327,7 +4322,19 @@
         <w:t>Basic movement of the positioner is accomplished through this function. The desired position is passed</w:t>
       </w:r>
       <w:r>
-        <w:t xml:space="preserve"> to the TigerStop in millimeters, which will cause the positioner to move to the provided position, if possible</w:t>
+        <w:t xml:space="preserve"> to the TigerStop in</w:t>
+      </w:r>
+      <w:r>
+        <w:t xml:space="preserve"> the currently set units.</w:t>
+      </w:r>
+      <w:r>
+        <w:t xml:space="preserve"> </w:t>
+      </w:r>
+      <w:r>
+        <w:t>This</w:t>
+      </w:r>
+      <w:r>
+        <w:t xml:space="preserve"> will cause the positioner to move to the provided position, if possible</w:t>
       </w:r>
     </w:p>
     <w:p>
@@ -4349,15 +4356,7 @@
         <w:spacing w:line="360" w:lineRule="auto"/>
       </w:pPr>
       <w:r>
-        <w:t>Identifier: “</w:t>
-      </w:r>
-      <w:proofErr w:type="spellStart"/>
-      <w:r>
-        <w:t>move_to</w:t>
-      </w:r>
-      <w:proofErr w:type="spellEnd"/>
-      <w:r>
-        <w:t>”</w:t>
+        <w:t>Identifier: “move_to”</w:t>
       </w:r>
     </w:p>
     <w:p>
@@ -4388,6 +4387,50 @@
     </w:p>
     <w:p>
       <w:pPr>
+        <w:pStyle w:val="Heading4"/>
+        <w:spacing w:line="360" w:lineRule="auto"/>
+      </w:pPr>
+      <w:r>
+        <w:t>Response</w:t>
+      </w:r>
+    </w:p>
+    <w:p>
+      <w:pPr>
+        <w:pStyle w:val="ListParagraph"/>
+        <w:numPr>
+          <w:ilvl w:val="0"/>
+          <w:numId w:val="20"/>
+        </w:numPr>
+        <w:spacing w:line="360" w:lineRule="auto"/>
+      </w:pPr>
+      <w:r>
+        <w:t>M</w:t>
+      </w:r>
+      <w:r>
+        <w:t xml:space="preserve">essage </w:t>
+      </w:r>
+      <w:r>
+        <w:t>Code: 0</w:t>
+      </w:r>
+    </w:p>
+    <w:p>
+      <w:pPr>
+        <w:pStyle w:val="ListParagraph"/>
+        <w:numPr>
+          <w:ilvl w:val="0"/>
+          <w:numId w:val="20"/>
+        </w:numPr>
+        <w:spacing w:line="360" w:lineRule="auto"/>
+      </w:pPr>
+      <w:r>
+        <w:t>Possible Error</w:t>
+      </w:r>
+      <w:r>
+        <w:t xml:space="preserve"> Codes</w:t>
+      </w:r>
+    </w:p>
+    <w:p>
+      <w:pPr>
         <w:pStyle w:val="ListParagraph"/>
         <w:numPr>
           <w:ilvl w:val="1"/>
@@ -4396,7 +4439,32 @@
         <w:spacing w:line="360" w:lineRule="auto"/>
       </w:pPr>
       <w:r>
-        <w:t>Note: position values must be sent in metric millimeters</w:t>
+        <w:t>101, 102, 103, 105, 108, 109, 110, 111, 112, 113, 114, 115, 116</w:t>
+      </w:r>
+      <w:r>
+        <w:t>, 120, 121, 122, 123, 124</w:t>
+      </w:r>
+    </w:p>
+    <w:p>
+      <w:pPr>
+        <w:pStyle w:val="Heading3"/>
+        <w:spacing w:line="360" w:lineRule="auto"/>
+      </w:pPr>
+      <w:bookmarkStart w:id="10" w:name="_Toc188363609"/>
+      <w:r>
+        <w:t>Get Setting Function</w:t>
+      </w:r>
+      <w:bookmarkEnd w:id="10"/>
+    </w:p>
+    <w:p>
+      <w:pPr>
+        <w:spacing w:line="360" w:lineRule="auto"/>
+      </w:pPr>
+      <w:r>
+        <w:t xml:space="preserve">There are specific settings from the TigerStop, whose values can be read. </w:t>
+      </w:r>
+      <w:r>
+        <w:t>The setting name determines which setting to get, and both name and value are sent back upon success.</w:t>
       </w:r>
     </w:p>
     <w:p>
@@ -4405,7 +4473,7 @@
         <w:spacing w:line="360" w:lineRule="auto"/>
       </w:pPr>
       <w:r>
-        <w:t>Response</w:t>
+        <w:t>Request</w:t>
       </w:r>
     </w:p>
     <w:p>
@@ -4418,13 +4486,7 @@
         <w:spacing w:line="360" w:lineRule="auto"/>
       </w:pPr>
       <w:r>
-        <w:t>M</w:t>
-      </w:r>
-      <w:r>
-        <w:t xml:space="preserve">essage </w:t>
-      </w:r>
-      <w:r>
-        <w:t>Code: 0</w:t>
+        <w:t>Identifier: “get_setting”</w:t>
       </w:r>
     </w:p>
     <w:p>
@@ -4437,10 +4499,20 @@
         <w:spacing w:line="360" w:lineRule="auto"/>
       </w:pPr>
       <w:r>
-        <w:t>Possible Error</w:t>
-      </w:r>
-      <w:r>
-        <w:t xml:space="preserve"> Codes</w:t>
+        <w:t>Parameters: Setting Name</w:t>
+      </w:r>
+    </w:p>
+    <w:p>
+      <w:pPr>
+        <w:pStyle w:val="ListParagraph"/>
+        <w:numPr>
+          <w:ilvl w:val="0"/>
+          <w:numId w:val="20"/>
+        </w:numPr>
+        <w:spacing w:line="360" w:lineRule="auto"/>
+      </w:pPr>
+      <w:r>
+        <w:t>Available Settings:</w:t>
       </w:r>
     </w:p>
     <w:p>
@@ -4453,41 +4525,194 @@
         <w:spacing w:line="360" w:lineRule="auto"/>
       </w:pPr>
       <w:r>
-        <w:t>101, 102, 103, 105, 108, 109, 110, 111, 112, 113, 114, 115, 116</w:t>
-      </w:r>
-      <w:r>
-        <w:t>, 120, 121, 122, 123, 124</w:t>
-      </w:r>
-    </w:p>
-    <w:p>
-      <w:pPr>
-        <w:pStyle w:val="Heading3"/>
-        <w:spacing w:line="360" w:lineRule="auto"/>
-      </w:pPr>
-      <w:bookmarkStart w:id="10" w:name="_Toc188363609"/>
-      <w:r>
-        <w:lastRenderedPageBreak/>
-        <w:t>Get Setting Function</w:t>
-      </w:r>
-      <w:bookmarkEnd w:id="10"/>
-    </w:p>
-    <w:p>
-      <w:pPr>
-        <w:spacing w:line="360" w:lineRule="auto"/>
-      </w:pPr>
-      <w:r>
-        <w:t xml:space="preserve">There are specific settings from </w:t>
-      </w:r>
-      <w:proofErr w:type="gramStart"/>
-      <w:r>
-        <w:t>the TigerStop</w:t>
-      </w:r>
-      <w:proofErr w:type="gramEnd"/>
-      <w:r>
-        <w:t xml:space="preserve">, whose values can be read. </w:t>
-      </w:r>
-      <w:r>
-        <w:t>The setting name determines which setting to get, and both name and value are sent back upon success.</w:t>
+        <w:t>“minlim”</w:t>
+      </w:r>
+    </w:p>
+    <w:p>
+      <w:pPr>
+        <w:pStyle w:val="ListParagraph"/>
+        <w:numPr>
+          <w:ilvl w:val="2"/>
+          <w:numId w:val="20"/>
+        </w:numPr>
+        <w:spacing w:line="360" w:lineRule="auto"/>
+      </w:pPr>
+      <w:r>
+        <w:t>The minimum limit of the machine (</w:t>
+      </w:r>
+      <w:r>
+        <w:t>in current units</w:t>
+      </w:r>
+      <w:r>
+        <w:t>)</w:t>
+      </w:r>
+    </w:p>
+    <w:p>
+      <w:pPr>
+        <w:pStyle w:val="ListParagraph"/>
+        <w:numPr>
+          <w:ilvl w:val="1"/>
+          <w:numId w:val="20"/>
+        </w:numPr>
+        <w:spacing w:line="360" w:lineRule="auto"/>
+      </w:pPr>
+      <w:r>
+        <w:t>“maxlim”</w:t>
+      </w:r>
+    </w:p>
+    <w:p>
+      <w:pPr>
+        <w:pStyle w:val="ListParagraph"/>
+        <w:numPr>
+          <w:ilvl w:val="2"/>
+          <w:numId w:val="20"/>
+        </w:numPr>
+        <w:spacing w:line="360" w:lineRule="auto"/>
+      </w:pPr>
+      <w:r>
+        <w:t>The maximum limit of the machine (</w:t>
+      </w:r>
+      <w:r>
+        <w:t>in current units</w:t>
+      </w:r>
+      <w:r>
+        <w:t>)</w:t>
+      </w:r>
+    </w:p>
+    <w:p>
+      <w:pPr>
+        <w:pStyle w:val="ListParagraph"/>
+        <w:numPr>
+          <w:ilvl w:val="1"/>
+          <w:numId w:val="20"/>
+        </w:numPr>
+        <w:spacing w:line="360" w:lineRule="auto"/>
+      </w:pPr>
+      <w:r>
+        <w:t>“toolik”</w:t>
+      </w:r>
+    </w:p>
+    <w:p>
+      <w:pPr>
+        <w:pStyle w:val="ListParagraph"/>
+        <w:numPr>
+          <w:ilvl w:val="2"/>
+          <w:numId w:val="20"/>
+        </w:numPr>
+        <w:spacing w:line="360" w:lineRule="auto"/>
+      </w:pPr>
+      <w:r>
+        <w:t>The tool’s current Interconnect Kit type</w:t>
+      </w:r>
+    </w:p>
+    <w:p>
+      <w:pPr>
+        <w:pStyle w:val="ListParagraph"/>
+        <w:numPr>
+          <w:ilvl w:val="2"/>
+          <w:numId w:val="20"/>
+        </w:numPr>
+        <w:spacing w:line="360" w:lineRule="auto"/>
+      </w:pPr>
+      <w:r>
+        <w:t>0 represents No Interconnect Kit</w:t>
+      </w:r>
+    </w:p>
+    <w:p>
+      <w:pPr>
+        <w:pStyle w:val="ListParagraph"/>
+        <w:numPr>
+          <w:ilvl w:val="2"/>
+          <w:numId w:val="20"/>
+        </w:numPr>
+        <w:spacing w:line="360" w:lineRule="auto"/>
+      </w:pPr>
+      <w:r>
+        <w:t>1 represents Standard Interconnect Kit</w:t>
+      </w:r>
+    </w:p>
+    <w:p>
+      <w:pPr>
+        <w:pStyle w:val="ListParagraph"/>
+        <w:numPr>
+          <w:ilvl w:val="2"/>
+          <w:numId w:val="20"/>
+        </w:numPr>
+        <w:spacing w:line="360" w:lineRule="auto"/>
+      </w:pPr>
+      <w:r>
+        <w:t>2 represents Full Auto</w:t>
+      </w:r>
+    </w:p>
+    <w:p>
+      <w:pPr>
+        <w:pStyle w:val="ListParagraph"/>
+        <w:numPr>
+          <w:ilvl w:val="2"/>
+          <w:numId w:val="20"/>
+        </w:numPr>
+        <w:spacing w:line="360" w:lineRule="auto"/>
+      </w:pPr>
+      <w:r>
+        <w:t xml:space="preserve">Note: </w:t>
+      </w:r>
+      <w:r>
+        <w:t>See TigerStop Pro’s manual for more information</w:t>
+      </w:r>
+    </w:p>
+    <w:p>
+      <w:pPr>
+        <w:pStyle w:val="ListParagraph"/>
+        <w:numPr>
+          <w:ilvl w:val="1"/>
+          <w:numId w:val="20"/>
+        </w:numPr>
+        <w:spacing w:line="360" w:lineRule="auto"/>
+      </w:pPr>
+      <w:r>
+        <w:t>“units”</w:t>
+      </w:r>
+    </w:p>
+    <w:p>
+      <w:pPr>
+        <w:pStyle w:val="ListParagraph"/>
+        <w:numPr>
+          <w:ilvl w:val="2"/>
+          <w:numId w:val="20"/>
+        </w:numPr>
+        <w:spacing w:line="360" w:lineRule="auto"/>
+      </w:pPr>
+      <w:r>
+        <w:t>The current unit type</w:t>
+      </w:r>
+      <w:r>
+        <w:t>.</w:t>
+      </w:r>
+    </w:p>
+    <w:p>
+      <w:pPr>
+        <w:pStyle w:val="ListParagraph"/>
+        <w:numPr>
+          <w:ilvl w:val="2"/>
+          <w:numId w:val="20"/>
+        </w:numPr>
+        <w:spacing w:line="360" w:lineRule="auto"/>
+      </w:pPr>
+      <w:r>
+        <w:t>0 represents millimeters</w:t>
+      </w:r>
+    </w:p>
+    <w:p>
+      <w:pPr>
+        <w:pStyle w:val="ListParagraph"/>
+        <w:numPr>
+          <w:ilvl w:val="2"/>
+          <w:numId w:val="20"/>
+        </w:numPr>
+        <w:spacing w:line="360" w:lineRule="auto"/>
+      </w:pPr>
+      <w:r>
+        <w:t>1 represents inches</w:t>
       </w:r>
     </w:p>
     <w:p>
@@ -4496,7 +4721,7 @@
         <w:spacing w:line="360" w:lineRule="auto"/>
       </w:pPr>
       <w:r>
-        <w:t>Request</w:t>
+        <w:t>Response</w:t>
       </w:r>
     </w:p>
     <w:p>
@@ -4509,15 +4734,58 @@
         <w:spacing w:line="360" w:lineRule="auto"/>
       </w:pPr>
       <w:r>
-        <w:t>Identifier: “</w:t>
-      </w:r>
-      <w:proofErr w:type="spellStart"/>
-      <w:r>
-        <w:t>get_setting</w:t>
-      </w:r>
-      <w:proofErr w:type="spellEnd"/>
+        <w:t>Message f</w:t>
+      </w:r>
+      <w:r>
+        <w:t xml:space="preserve">ormat: </w:t>
+      </w:r>
+      <w:r>
+        <w:t>“1|{Setting Name}|{Setting Value}</w:t>
+      </w:r>
+      <w:r>
+        <w:t>\n</w:t>
+      </w:r>
       <w:r>
         <w:t>”</w:t>
+      </w:r>
+    </w:p>
+    <w:p>
+      <w:pPr>
+        <w:pStyle w:val="ListParagraph"/>
+        <w:numPr>
+          <w:ilvl w:val="1"/>
+          <w:numId w:val="20"/>
+        </w:numPr>
+        <w:spacing w:line="360" w:lineRule="auto"/>
+      </w:pPr>
+      <w:r>
+        <w:t>Message Code: 1</w:t>
+      </w:r>
+    </w:p>
+    <w:p>
+      <w:pPr>
+        <w:pStyle w:val="ListParagraph"/>
+        <w:numPr>
+          <w:ilvl w:val="1"/>
+          <w:numId w:val="20"/>
+        </w:numPr>
+        <w:spacing w:line="360" w:lineRule="auto"/>
+      </w:pPr>
+      <w:r>
+        <w:t>Setting Name: The name of the requested setting</w:t>
+      </w:r>
+    </w:p>
+    <w:p>
+      <w:pPr>
+        <w:pStyle w:val="ListParagraph"/>
+        <w:numPr>
+          <w:ilvl w:val="1"/>
+          <w:numId w:val="20"/>
+        </w:numPr>
+        <w:spacing w:line="360" w:lineRule="auto"/>
+      </w:pPr>
+      <w:r>
+        <w:t>Setting Value: The value of the requested setting</w:t>
       </w:r>
     </w:p>
     <w:p>
@@ -4530,7 +4798,45 @@
         <w:spacing w:line="360" w:lineRule="auto"/>
       </w:pPr>
       <w:r>
-        <w:t>Parameters: Setting Name</w:t>
+        <w:t>Possible error codes</w:t>
+      </w:r>
+    </w:p>
+    <w:p>
+      <w:pPr>
+        <w:pStyle w:val="ListParagraph"/>
+        <w:numPr>
+          <w:ilvl w:val="1"/>
+          <w:numId w:val="20"/>
+        </w:numPr>
+        <w:spacing w:line="360" w:lineRule="auto"/>
+      </w:pPr>
+      <w:r>
+        <w:t xml:space="preserve"> </w:t>
+      </w:r>
+      <w:r>
+        <w:t>107</w:t>
+      </w:r>
+    </w:p>
+    <w:p>
+      <w:pPr>
+        <w:pStyle w:val="Heading3"/>
+      </w:pPr>
+      <w:r>
+        <w:t>Set Units Function</w:t>
+      </w:r>
+    </w:p>
+    <w:p>
+      <w:r>
+        <w:t>Requests for the TigerStop to handle all positional data in the specified units.</w:t>
+      </w:r>
+    </w:p>
+    <w:p>
+      <w:pPr>
+        <w:pStyle w:val="Heading4"/>
+        <w:spacing w:line="360" w:lineRule="auto"/>
+      </w:pPr>
+      <w:r>
+        <w:t>Request</w:t>
       </w:r>
     </w:p>
     <w:p>
@@ -4543,7 +4849,54 @@
         <w:spacing w:line="360" w:lineRule="auto"/>
       </w:pPr>
       <w:r>
-        <w:t>Available Settings:</w:t>
+        <w:t>Identifier: “</w:t>
+      </w:r>
+      <w:r>
+        <w:t>s</w:t>
+      </w:r>
+      <w:r>
+        <w:t>et_</w:t>
+      </w:r>
+      <w:r>
+        <w:t>units</w:t>
+      </w:r>
+      <w:r>
+        <w:t>”</w:t>
+      </w:r>
+    </w:p>
+    <w:p>
+      <w:pPr>
+        <w:pStyle w:val="ListParagraph"/>
+        <w:numPr>
+          <w:ilvl w:val="0"/>
+          <w:numId w:val="20"/>
+        </w:numPr>
+        <w:spacing w:line="360" w:lineRule="auto"/>
+      </w:pPr>
+      <w:r>
+        <w:t xml:space="preserve">Parameters: </w:t>
+      </w:r>
+      <w:r>
+        <w:t>Unit Type</w:t>
+      </w:r>
+    </w:p>
+    <w:p>
+      <w:pPr>
+        <w:pStyle w:val="ListParagraph"/>
+        <w:numPr>
+          <w:ilvl w:val="0"/>
+          <w:numId w:val="20"/>
+        </w:numPr>
+        <w:spacing w:line="360" w:lineRule="auto"/>
+      </w:pPr>
+      <w:r>
+        <w:t xml:space="preserve">Available </w:t>
+      </w:r>
+      <w:r>
+        <w:t>Unit Type values</w:t>
+      </w:r>
+      <w:r>
+        <w:t>:</w:t>
       </w:r>
     </w:p>
     <w:p>
@@ -4558,11 +4911,9 @@
       <w:r>
         <w:t>“</w:t>
       </w:r>
-      <w:proofErr w:type="spellStart"/>
-      <w:r>
-        <w:t>minlim</w:t>
-      </w:r>
-      <w:proofErr w:type="spellEnd"/>
+      <w:r>
+        <w:t>0</w:t>
+      </w:r>
       <w:r>
         <w:t>”</w:t>
       </w:r>
@@ -4577,7 +4928,7 @@
         <w:spacing w:line="360" w:lineRule="auto"/>
       </w:pPr>
       <w:r>
-        <w:t>The minimum limit of the machine (mm)</w:t>
+        <w:t>Sets the units to millimeters</w:t>
       </w:r>
     </w:p>
     <w:p>
@@ -4592,11 +4943,9 @@
       <w:r>
         <w:t>“</w:t>
       </w:r>
-      <w:proofErr w:type="spellStart"/>
-      <w:r>
-        <w:t>maxlim</w:t>
-      </w:r>
-      <w:proofErr w:type="spellEnd"/>
+      <w:r>
+        <w:t>1</w:t>
+      </w:r>
       <w:r>
         <w:t>”</w:t>
       </w:r>
@@ -4611,7 +4960,7 @@
         <w:spacing w:line="360" w:lineRule="auto"/>
       </w:pPr>
       <w:r>
-        <w:t>The maximum limit of the machine (mm)</w:t>
+        <w:t>Sets the units to inches</w:t>
       </w:r>
     </w:p>
     <w:p>
@@ -4633,43 +4982,13 @@
         <w:spacing w:line="360" w:lineRule="auto"/>
       </w:pPr>
       <w:r>
-        <w:t>Message f</w:t>
-      </w:r>
-      <w:r>
-        <w:t xml:space="preserve">ormat: </w:t>
-      </w:r>
-      <w:r>
-        <w:t>“1</w:t>
-      </w:r>
-      <w:proofErr w:type="gramStart"/>
-      <w:r>
-        <w:t>|{</w:t>
-      </w:r>
-      <w:proofErr w:type="gramEnd"/>
-      <w:r>
-        <w:t xml:space="preserve">Setting </w:t>
-      </w:r>
-      <w:proofErr w:type="gramStart"/>
-      <w:r>
-        <w:t>Name}|</w:t>
-      </w:r>
-      <w:proofErr w:type="gramEnd"/>
-      <w:r>
-        <w:t xml:space="preserve">{Setting </w:t>
-      </w:r>
-      <w:proofErr w:type="gramStart"/>
-      <w:r>
-        <w:t>Value}</w:t>
-      </w:r>
-      <w:r>
-        <w:t>\</w:t>
-      </w:r>
-      <w:proofErr w:type="gramEnd"/>
-      <w:r>
-        <w:t>n</w:t>
-      </w:r>
-      <w:r>
-        <w:t>”</w:t>
+        <w:t>Message format: “1</w:t>
+      </w:r>
+      <w:r>
+        <w:t>9</w:t>
+      </w:r>
+      <w:r>
+        <w:t>\n”</w:t>
       </w:r>
     </w:p>
     <w:p>
@@ -4684,6 +5003,22 @@
       <w:r>
         <w:t>Message Code: 1</w:t>
       </w:r>
+      <w:r>
+        <w:t>9</w:t>
+      </w:r>
+    </w:p>
+    <w:p>
+      <w:pPr>
+        <w:pStyle w:val="ListParagraph"/>
+        <w:numPr>
+          <w:ilvl w:val="0"/>
+          <w:numId w:val="20"/>
+        </w:numPr>
+        <w:spacing w:line="360" w:lineRule="auto"/>
+      </w:pPr>
+      <w:r>
+        <w:t>Possible error codes</w:t>
+      </w:r>
     </w:p>
     <w:p>
       <w:pPr>
@@ -4695,7 +5030,96 @@
         <w:spacing w:line="360" w:lineRule="auto"/>
       </w:pPr>
       <w:r>
-        <w:t>Setting Name: The name of the requested setting</w:t>
+        <w:t xml:space="preserve"> 107</w:t>
+      </w:r>
+    </w:p>
+    <w:p/>
+    <w:p>
+      <w:pPr>
+        <w:pStyle w:val="Heading3"/>
+        <w:spacing w:line="360" w:lineRule="auto"/>
+      </w:pPr>
+      <w:bookmarkStart w:id="11" w:name="_Toc188363610"/>
+      <w:r>
+        <w:t>Get Position Function</w:t>
+      </w:r>
+      <w:bookmarkEnd w:id="11"/>
+    </w:p>
+    <w:p>
+      <w:r>
+        <w:t xml:space="preserve">Provides the current position of the positioner, relative to the tool, </w:t>
+      </w:r>
+      <w:r>
+        <w:t>in the currently set units</w:t>
+      </w:r>
+      <w:r>
+        <w:t>.</w:t>
+      </w:r>
+    </w:p>
+    <w:p>
+      <w:pPr>
+        <w:pStyle w:val="Heading4"/>
+        <w:spacing w:line="360" w:lineRule="auto"/>
+      </w:pPr>
+      <w:r>
+        <w:t>Request</w:t>
+      </w:r>
+    </w:p>
+    <w:p>
+      <w:pPr>
+        <w:pStyle w:val="ListParagraph"/>
+        <w:numPr>
+          <w:ilvl w:val="0"/>
+          <w:numId w:val="20"/>
+        </w:numPr>
+        <w:spacing w:line="360" w:lineRule="auto"/>
+      </w:pPr>
+      <w:r>
+        <w:t>Identifier: “get_position”</w:t>
+      </w:r>
+    </w:p>
+    <w:p>
+      <w:pPr>
+        <w:pStyle w:val="ListParagraph"/>
+        <w:numPr>
+          <w:ilvl w:val="0"/>
+          <w:numId w:val="20"/>
+        </w:numPr>
+        <w:spacing w:line="360" w:lineRule="auto"/>
+      </w:pPr>
+      <w:r>
+        <w:t>Parameters: None</w:t>
+      </w:r>
+    </w:p>
+    <w:p>
+      <w:pPr>
+        <w:pStyle w:val="Heading4"/>
+        <w:spacing w:line="360" w:lineRule="auto"/>
+      </w:pPr>
+      <w:r>
+        <w:t>Response</w:t>
+      </w:r>
+    </w:p>
+    <w:p>
+      <w:pPr>
+        <w:pStyle w:val="ListParagraph"/>
+        <w:numPr>
+          <w:ilvl w:val="0"/>
+          <w:numId w:val="20"/>
+        </w:numPr>
+        <w:spacing w:line="360" w:lineRule="auto"/>
+      </w:pPr>
+      <w:r>
+        <w:t>Message format</w:t>
+      </w:r>
+      <w:r>
+        <w:t>: “2|{position}</w:t>
+      </w:r>
+      <w:r>
+        <w:t>\n</w:t>
+      </w:r>
+      <w:r>
+        <w:t>”</w:t>
       </w:r>
     </w:p>
     <w:p>
@@ -4708,7 +5132,117 @@
         <w:spacing w:line="360" w:lineRule="auto"/>
       </w:pPr>
       <w:r>
-        <w:t>Setting Value: The value of the requested setting</w:t>
+        <w:t>Message Code: 2</w:t>
+      </w:r>
+    </w:p>
+    <w:p>
+      <w:pPr>
+        <w:pStyle w:val="ListParagraph"/>
+        <w:numPr>
+          <w:ilvl w:val="1"/>
+          <w:numId w:val="20"/>
+        </w:numPr>
+        <w:spacing w:line="360" w:lineRule="auto"/>
+      </w:pPr>
+      <w:r>
+        <w:t xml:space="preserve">Position: The current position of the positioner (in </w:t>
+      </w:r>
+      <w:r>
+        <w:t>current units</w:t>
+      </w:r>
+      <w:r>
+        <w:t>)</w:t>
+      </w:r>
+    </w:p>
+    <w:p>
+      <w:pPr>
+        <w:pStyle w:val="ListParagraph"/>
+        <w:numPr>
+          <w:ilvl w:val="2"/>
+          <w:numId w:val="20"/>
+        </w:numPr>
+        <w:spacing w:line="360" w:lineRule="auto"/>
+      </w:pPr>
+      <w:r>
+        <w:t xml:space="preserve">Note: Position will be a </w:t>
+      </w:r>
+      <w:r>
+        <w:t>float</w:t>
+      </w:r>
+      <w:r>
+        <w:t>ing-point number</w:t>
+      </w:r>
+      <w:r>
+        <w:t>, but will be represented as a string in the response message</w:t>
+      </w:r>
+    </w:p>
+    <w:p>
+      <w:pPr>
+        <w:pStyle w:val="Heading3"/>
+        <w:spacing w:line="360" w:lineRule="auto"/>
+      </w:pPr>
+      <w:bookmarkStart w:id="12" w:name="_Toc188363611"/>
+      <w:r>
+        <w:t>Calibrate Function</w:t>
+      </w:r>
+      <w:bookmarkEnd w:id="12"/>
+    </w:p>
+    <w:p>
+      <w:pPr>
+        <w:spacing w:line="360" w:lineRule="auto"/>
+      </w:pPr>
+      <w:r>
+        <w:t>Calibration specifies where the positioner is relative to the tool. The current position becomes the calibrated position</w:t>
+      </w:r>
+      <w:r>
+        <w:t>, and the end limits are shifted by the difference between the calibrated position and the pre-calibrated position.</w:t>
+      </w:r>
+    </w:p>
+    <w:p>
+      <w:pPr>
+        <w:spacing w:line="360" w:lineRule="auto"/>
+      </w:pPr>
+      <w:r>
+        <w:t xml:space="preserve">For example, </w:t>
+      </w:r>
+      <w:r>
+        <w:t>say you have</w:t>
+      </w:r>
+      <w:r>
+        <w:t xml:space="preserve"> a minimum limit of 0, a maximum limit of 100, and a current position of 5. After calibrating to 0, </w:t>
+      </w:r>
+      <w:r>
+        <w:t>your</w:t>
+      </w:r>
+      <w:r>
+        <w:t xml:space="preserve"> minimum limit </w:t>
+      </w:r>
+      <w:r>
+        <w:t xml:space="preserve">will be </w:t>
+      </w:r>
+      <w:r>
+        <w:t xml:space="preserve">-5, maximum limit </w:t>
+      </w:r>
+      <w:r>
+        <w:t>will be</w:t>
+      </w:r>
+      <w:r>
+        <w:t xml:space="preserve"> 95, and current position </w:t>
+      </w:r>
+      <w:r>
+        <w:t>will be</w:t>
+      </w:r>
+      <w:r>
+        <w:t xml:space="preserve"> 0.</w:t>
+      </w:r>
+    </w:p>
+    <w:p>
+      <w:pPr>
+        <w:pStyle w:val="Heading4"/>
+        <w:spacing w:line="360" w:lineRule="auto"/>
+      </w:pPr>
+      <w:r>
+        <w:t>Request</w:t>
       </w:r>
     </w:p>
     <w:p>
@@ -4721,7 +5255,23 @@
         <w:spacing w:line="360" w:lineRule="auto"/>
       </w:pPr>
       <w:r>
-        <w:t>Possible error codes</w:t>
+        <w:t>Identifier: “calibrate”</w:t>
+      </w:r>
+    </w:p>
+    <w:p>
+      <w:pPr>
+        <w:pStyle w:val="ListParagraph"/>
+        <w:numPr>
+          <w:ilvl w:val="0"/>
+          <w:numId w:val="20"/>
+        </w:numPr>
+        <w:spacing w:line="360" w:lineRule="auto"/>
+      </w:pPr>
+      <w:r>
+        <w:t>Parameters: position</w:t>
+      </w:r>
+      <w:r>
+        <w:t>, given in the current units.</w:t>
       </w:r>
     </w:p>
     <w:p>
@@ -4734,26 +5284,7 @@
         <w:spacing w:line="360" w:lineRule="auto"/>
       </w:pPr>
       <w:r>
-        <w:t xml:space="preserve"> </w:t>
-      </w:r>
-      <w:r>
-        <w:t>107</w:t>
-      </w:r>
-    </w:p>
-    <w:p>
-      <w:pPr>
-        <w:pStyle w:val="Heading3"/>
-        <w:spacing w:line="360" w:lineRule="auto"/>
-      </w:pPr>
-      <w:bookmarkStart w:id="11" w:name="_Toc188363610"/>
-      <w:r>
-        <w:t>Get Position Function</w:t>
-      </w:r>
-      <w:bookmarkEnd w:id="11"/>
-    </w:p>
-    <w:p>
-      <w:r>
-        <w:t>Provides the current position of the positioner, relative to the tool, in millimeters.</w:t>
+        <w:t>Type: float</w:t>
       </w:r>
     </w:p>
     <w:p>
@@ -4762,7 +5293,7 @@
         <w:spacing w:line="360" w:lineRule="auto"/>
       </w:pPr>
       <w:r>
-        <w:t>Request</w:t>
+        <w:t>Response</w:t>
       </w:r>
     </w:p>
     <w:p>
@@ -4772,18 +5303,58 @@
           <w:ilvl w:val="0"/>
           <w:numId w:val="20"/>
         </w:numPr>
-        <w:spacing w:line="360" w:lineRule="auto"/>
-      </w:pPr>
-      <w:r>
-        <w:t>Identifier: “</w:t>
-      </w:r>
-      <w:proofErr w:type="spellStart"/>
-      <w:r>
-        <w:t>get_position</w:t>
-      </w:r>
-      <w:proofErr w:type="spellEnd"/>
-      <w:r>
-        <w:t>”</w:t>
+      </w:pPr>
+      <w:r>
+        <w:t>Possible Error</w:t>
+      </w:r>
+      <w:r>
+        <w:t xml:space="preserve"> Codes</w:t>
+      </w:r>
+      <w:r>
+        <w:t>:</w:t>
+      </w:r>
+    </w:p>
+    <w:p>
+      <w:pPr>
+        <w:pStyle w:val="ListParagraph"/>
+        <w:numPr>
+          <w:ilvl w:val="1"/>
+          <w:numId w:val="20"/>
+        </w:numPr>
+      </w:pPr>
+      <w:r>
+        <w:t>117</w:t>
+      </w:r>
+    </w:p>
+    <w:p>
+      <w:pPr>
+        <w:pStyle w:val="Heading3"/>
+        <w:spacing w:line="360" w:lineRule="auto"/>
+      </w:pPr>
+      <w:bookmarkStart w:id="13" w:name="_Toc188363612"/>
+      <w:r>
+        <w:t xml:space="preserve">Home </w:t>
+      </w:r>
+      <w:r>
+        <w:t xml:space="preserve">Routine </w:t>
+      </w:r>
+      <w:r>
+        <w:t>Function</w:t>
+      </w:r>
+      <w:bookmarkEnd w:id="13"/>
+    </w:p>
+    <w:p>
+      <w:r>
+        <w:t xml:space="preserve">Sends the positioner to the far end of the beam (relative to the tool), allowing for a consistent reference point for positioning. The controller will respond with message code 0 four consecutive times during a successful home routine, with each one signaling a separate step of the routine. The fourth message in the series indicates a successfully completed routine. </w:t>
+      </w:r>
+    </w:p>
+    <w:p>
+      <w:pPr>
+        <w:pStyle w:val="Heading4"/>
+        <w:spacing w:line="360" w:lineRule="auto"/>
+      </w:pPr>
+      <w:r>
+        <w:t>Request</w:t>
       </w:r>
     </w:p>
     <w:p>
@@ -4796,16 +5367,7 @@
         <w:spacing w:line="360" w:lineRule="auto"/>
       </w:pPr>
       <w:r>
-        <w:t>Parameters: None</w:t>
-      </w:r>
-    </w:p>
-    <w:p>
-      <w:pPr>
-        <w:pStyle w:val="Heading4"/>
-        <w:spacing w:line="360" w:lineRule="auto"/>
-      </w:pPr>
-      <w:r>
-        <w:t>Response</w:t>
+        <w:t>Identifier: “home”</w:t>
       </w:r>
     </w:p>
     <w:p>
@@ -4818,16 +5380,34 @@
         <w:spacing w:line="360" w:lineRule="auto"/>
       </w:pPr>
       <w:r>
-        <w:t>Message format</w:t>
-      </w:r>
-      <w:r>
-        <w:t>: “2|{position}</w:t>
-      </w:r>
-      <w:r>
-        <w:t>\n</w:t>
-      </w:r>
-      <w:r>
-        <w:t>”</w:t>
+        <w:t>Parameters: None</w:t>
+      </w:r>
+    </w:p>
+    <w:p>
+      <w:pPr>
+        <w:pStyle w:val="Heading4"/>
+        <w:spacing w:line="360" w:lineRule="auto"/>
+      </w:pPr>
+      <w:r>
+        <w:t>Response</w:t>
+      </w:r>
+    </w:p>
+    <w:p>
+      <w:pPr>
+        <w:pStyle w:val="ListParagraph"/>
+        <w:numPr>
+          <w:ilvl w:val="0"/>
+          <w:numId w:val="20"/>
+        </w:numPr>
+      </w:pPr>
+      <w:r>
+        <w:t>Message format: “</w:t>
+      </w:r>
+      <w:r>
+        <w:t>0</w:t>
+      </w:r>
+      <w:r>
+        <w:t>\n”</w:t>
       </w:r>
     </w:p>
     <w:p>
@@ -4837,10 +5417,30 @@
           <w:ilvl w:val="1"/>
           <w:numId w:val="20"/>
         </w:numPr>
-        <w:spacing w:line="360" w:lineRule="auto"/>
-      </w:pPr>
-      <w:r>
-        <w:t>Message Code: 2</w:t>
+      </w:pPr>
+      <w:r>
+        <w:t xml:space="preserve">Message Code: </w:t>
+      </w:r>
+      <w:r>
+        <w:t>0</w:t>
+      </w:r>
+    </w:p>
+    <w:p>
+      <w:pPr>
+        <w:pStyle w:val="ListParagraph"/>
+        <w:numPr>
+          <w:ilvl w:val="0"/>
+          <w:numId w:val="20"/>
+        </w:numPr>
+      </w:pPr>
+      <w:r>
+        <w:t>Possible Error</w:t>
+      </w:r>
+      <w:r>
+        <w:t xml:space="preserve"> Codes</w:t>
+      </w:r>
+      <w:r>
+        <w:t>:</w:t>
       </w:r>
     </w:p>
     <w:p>
@@ -4850,84 +5450,133 @@
           <w:ilvl w:val="1"/>
           <w:numId w:val="20"/>
         </w:numPr>
-        <w:spacing w:line="360" w:lineRule="auto"/>
-      </w:pPr>
-      <w:r>
-        <w:t>Position: The current position of the positioner (in millimeters)</w:t>
+      </w:pPr>
+      <w:r>
+        <w:t>103, 108, 109, 110, 111, 112, 113, 114, 115, 116</w:t>
+      </w:r>
+      <w:r>
+        <w:t>, 120, 121, 122, 123, 124</w:t>
+      </w:r>
+    </w:p>
+    <w:p>
+      <w:r>
+        <w:br w:type="page"/>
+      </w:r>
+    </w:p>
+    <w:p>
+      <w:pPr>
+        <w:pStyle w:val="Heading3"/>
+        <w:spacing w:line="360" w:lineRule="auto"/>
+      </w:pPr>
+      <w:r>
+        <w:t xml:space="preserve">Cycle Tool </w:t>
+      </w:r>
+      <w:r>
+        <w:t>Function</w:t>
+      </w:r>
+    </w:p>
+    <w:p>
+      <w:r>
+        <w:t xml:space="preserve">Initiates a tool cycle sequence. The controller will respond with a message code for each step of the process until the tool cycle is completed or an error prevents completion. A full tool cycle </w:t>
+      </w:r>
+      <w:r>
+        <w:t>is as follows:</w:t>
       </w:r>
     </w:p>
     <w:p>
       <w:pPr>
         <w:pStyle w:val="ListParagraph"/>
         <w:numPr>
-          <w:ilvl w:val="2"/>
-          <w:numId w:val="20"/>
+          <w:ilvl w:val="0"/>
+          <w:numId w:val="26"/>
         </w:numPr>
-        <w:spacing w:line="360" w:lineRule="auto"/>
-      </w:pPr>
-      <w:r>
-        <w:t>Note: Position will be a float, but will be represented as a string in the response message</w:t>
-      </w:r>
-    </w:p>
-    <w:p>
-      <w:pPr>
-        <w:pStyle w:val="Heading3"/>
-        <w:spacing w:line="360" w:lineRule="auto"/>
-      </w:pPr>
-      <w:bookmarkStart w:id="12" w:name="_Toc188363611"/>
-      <w:r>
-        <w:lastRenderedPageBreak/>
-        <w:t>Calibrate Function</w:t>
-      </w:r>
-      <w:bookmarkEnd w:id="12"/>
-    </w:p>
-    <w:p>
-      <w:pPr>
-        <w:spacing w:line="360" w:lineRule="auto"/>
-      </w:pPr>
-      <w:r>
-        <w:t>Calibration specifies where the positioner is relative to the tool. The current position becomes the calibrated position</w:t>
-      </w:r>
-      <w:r>
-        <w:t>, and the end limits are shifted by the difference between the calibrated position and the pre-calibrated position.</w:t>
-      </w:r>
-    </w:p>
-    <w:p>
-      <w:pPr>
-        <w:spacing w:line="360" w:lineRule="auto"/>
-      </w:pPr>
-      <w:r>
-        <w:t xml:space="preserve">For example, </w:t>
-      </w:r>
-      <w:r>
-        <w:t>say you have</w:t>
-      </w:r>
-      <w:r>
-        <w:t xml:space="preserve"> a minimum limit of 0, a maximum limit of 100, and a current position of 5. After calibrating to 0, </w:t>
-      </w:r>
-      <w:r>
-        <w:t>your</w:t>
-      </w:r>
-      <w:r>
-        <w:t xml:space="preserve"> minimum limit </w:t>
-      </w:r>
-      <w:r>
-        <w:t xml:space="preserve">will be </w:t>
-      </w:r>
-      <w:r>
-        <w:t xml:space="preserve">-5, maximum limit </w:t>
-      </w:r>
-      <w:r>
-        <w:t>will be</w:t>
-      </w:r>
-      <w:r>
-        <w:t xml:space="preserve"> 95, and current position </w:t>
-      </w:r>
-      <w:r>
-        <w:t>will be</w:t>
-      </w:r>
-      <w:r>
-        <w:t xml:space="preserve"> 0.</w:t>
+      </w:pPr>
+      <w:r>
+        <w:t>Clamps engage: Message code 10</w:t>
+      </w:r>
+    </w:p>
+    <w:p>
+      <w:pPr>
+        <w:pStyle w:val="ListParagraph"/>
+        <w:numPr>
+          <w:ilvl w:val="0"/>
+          <w:numId w:val="26"/>
+        </w:numPr>
+      </w:pPr>
+      <w:r>
+        <w:t>Tool and motor enable signals sent: Message code 11 and message code 18</w:t>
+      </w:r>
+    </w:p>
+    <w:p>
+      <w:pPr>
+        <w:pStyle w:val="ListParagraph"/>
+        <w:numPr>
+          <w:ilvl w:val="0"/>
+          <w:numId w:val="26"/>
+        </w:numPr>
+      </w:pPr>
+      <w:r>
+        <w:t>Tool at rest sensor deactivated: Message code 12</w:t>
+      </w:r>
+    </w:p>
+    <w:p>
+      <w:pPr>
+        <w:pStyle w:val="ListParagraph"/>
+        <w:numPr>
+          <w:ilvl w:val="0"/>
+          <w:numId w:val="26"/>
+        </w:numPr>
+      </w:pPr>
+      <w:r>
+        <w:t>Tool at extension sensor activated: Message code 13</w:t>
+      </w:r>
+    </w:p>
+    <w:p>
+      <w:pPr>
+        <w:pStyle w:val="ListParagraph"/>
+        <w:numPr>
+          <w:ilvl w:val="0"/>
+          <w:numId w:val="26"/>
+        </w:numPr>
+      </w:pPr>
+      <w:r>
+        <w:t>Tool at extension sensor deactivated: Message code 14</w:t>
+      </w:r>
+    </w:p>
+    <w:p>
+      <w:pPr>
+        <w:pStyle w:val="ListParagraph"/>
+        <w:numPr>
+          <w:ilvl w:val="0"/>
+          <w:numId w:val="26"/>
+        </w:numPr>
+      </w:pPr>
+      <w:r>
+        <w:t>Tool at rest sensor activated: Message code 15</w:t>
+      </w:r>
+    </w:p>
+    <w:p>
+      <w:pPr>
+        <w:pStyle w:val="ListParagraph"/>
+        <w:numPr>
+          <w:ilvl w:val="0"/>
+          <w:numId w:val="26"/>
+        </w:numPr>
+      </w:pPr>
+      <w:r>
+        <w:t>Clamps disengaged: Message code 16</w:t>
+      </w:r>
+    </w:p>
+    <w:p>
+      <w:pPr>
+        <w:pStyle w:val="ListParagraph"/>
+        <w:numPr>
+          <w:ilvl w:val="0"/>
+          <w:numId w:val="26"/>
+        </w:numPr>
+      </w:pPr>
+      <w:r>
+        <w:t>Tool cycle complete: Message code 17</w:t>
       </w:r>
     </w:p>
     <w:p>
@@ -4949,7 +5598,13 @@
         <w:spacing w:line="360" w:lineRule="auto"/>
       </w:pPr>
       <w:r>
-        <w:t>Identifier: “calibrate”</w:t>
+        <w:t>Identifier: “</w:t>
+      </w:r>
+      <w:r>
+        <w:t>cycle_tool</w:t>
+      </w:r>
+      <w:r>
+        <w:t>”</w:t>
       </w:r>
     </w:p>
     <w:p>
@@ -4962,7 +5617,28 @@
         <w:spacing w:line="360" w:lineRule="auto"/>
       </w:pPr>
       <w:r>
-        <w:t>Parameters: position</w:t>
+        <w:t>Parameters: None</w:t>
+      </w:r>
+    </w:p>
+    <w:p>
+      <w:pPr>
+        <w:pStyle w:val="Heading4"/>
+        <w:spacing w:line="360" w:lineRule="auto"/>
+      </w:pPr>
+      <w:r>
+        <w:t>Response</w:t>
+      </w:r>
+    </w:p>
+    <w:p>
+      <w:pPr>
+        <w:pStyle w:val="ListParagraph"/>
+        <w:numPr>
+          <w:ilvl w:val="0"/>
+          <w:numId w:val="20"/>
+        </w:numPr>
+      </w:pPr>
+      <w:r>
+        <w:t>Possible Error Codes:</w:t>
       </w:r>
     </w:p>
     <w:p>
@@ -4972,195 +5648,16 @@
           <w:ilvl w:val="1"/>
           <w:numId w:val="20"/>
         </w:numPr>
-        <w:spacing w:line="360" w:lineRule="auto"/>
-      </w:pPr>
-      <w:r>
-        <w:t>Type: float</w:t>
-      </w:r>
-    </w:p>
-    <w:p>
-      <w:pPr>
-        <w:pStyle w:val="ListParagraph"/>
-        <w:numPr>
-          <w:ilvl w:val="1"/>
-          <w:numId w:val="20"/>
-        </w:numPr>
-        <w:spacing w:line="360" w:lineRule="auto"/>
-      </w:pPr>
-      <w:r>
-        <w:t>Note: position values must be sent in metric millimeters</w:t>
-      </w:r>
-    </w:p>
-    <w:p>
-      <w:pPr>
-        <w:pStyle w:val="Heading4"/>
-        <w:spacing w:line="360" w:lineRule="auto"/>
-      </w:pPr>
-      <w:r>
-        <w:t>Response</w:t>
-      </w:r>
-    </w:p>
-    <w:p>
-      <w:pPr>
-        <w:pStyle w:val="ListParagraph"/>
-        <w:numPr>
-          <w:ilvl w:val="0"/>
-          <w:numId w:val="20"/>
-        </w:numPr>
-      </w:pPr>
-      <w:r>
-        <w:t>Possible Error</w:t>
-      </w:r>
-      <w:r>
-        <w:t xml:space="preserve"> Codes</w:t>
-      </w:r>
-      <w:r>
-        <w:t>:</w:t>
-      </w:r>
-    </w:p>
-    <w:p>
-      <w:pPr>
-        <w:pStyle w:val="ListParagraph"/>
-        <w:numPr>
-          <w:ilvl w:val="1"/>
-          <w:numId w:val="20"/>
-        </w:numPr>
-      </w:pPr>
-      <w:r>
-        <w:t>117</w:t>
-      </w:r>
-    </w:p>
-    <w:p>
-      <w:pPr>
-        <w:pStyle w:val="Heading3"/>
-        <w:spacing w:line="360" w:lineRule="auto"/>
-      </w:pPr>
-      <w:bookmarkStart w:id="13" w:name="_Toc188363612"/>
-      <w:r>
-        <w:t xml:space="preserve">Home </w:t>
-      </w:r>
-      <w:r>
-        <w:t xml:space="preserve">Routine </w:t>
-      </w:r>
-      <w:r>
-        <w:t>Function</w:t>
-      </w:r>
-      <w:bookmarkEnd w:id="13"/>
-    </w:p>
-    <w:p>
-      <w:r>
-        <w:t xml:space="preserve">Sends the positioner to the far end of the beam (relative to the tool), allowing for a consistent reference point for positioning. The controller will respond with message code 0 four consecutive times during a successful home routine, with each one signaling a separate step of the routine. The fourth message in the series indicates a successfully completed routine. </w:t>
-      </w:r>
-    </w:p>
-    <w:p>
-      <w:pPr>
-        <w:pStyle w:val="Heading4"/>
-        <w:spacing w:line="360" w:lineRule="auto"/>
-      </w:pPr>
-      <w:r>
-        <w:t>Request</w:t>
-      </w:r>
-    </w:p>
-    <w:p>
-      <w:pPr>
-        <w:pStyle w:val="ListParagraph"/>
-        <w:numPr>
-          <w:ilvl w:val="0"/>
-          <w:numId w:val="20"/>
-        </w:numPr>
-        <w:spacing w:line="360" w:lineRule="auto"/>
-      </w:pPr>
-      <w:r>
-        <w:t>Identifier: “home”</w:t>
-      </w:r>
-    </w:p>
-    <w:p>
-      <w:pPr>
-        <w:pStyle w:val="ListParagraph"/>
-        <w:numPr>
-          <w:ilvl w:val="0"/>
-          <w:numId w:val="20"/>
-        </w:numPr>
-        <w:spacing w:line="360" w:lineRule="auto"/>
-      </w:pPr>
-      <w:r>
-        <w:t>Parameters: None</w:t>
-      </w:r>
-    </w:p>
-    <w:p>
-      <w:pPr>
-        <w:pStyle w:val="Heading4"/>
-        <w:spacing w:line="360" w:lineRule="auto"/>
-      </w:pPr>
-      <w:r>
-        <w:t>Response</w:t>
-      </w:r>
-    </w:p>
-    <w:p>
-      <w:pPr>
-        <w:pStyle w:val="ListParagraph"/>
-        <w:numPr>
-          <w:ilvl w:val="0"/>
-          <w:numId w:val="20"/>
-        </w:numPr>
-      </w:pPr>
-      <w:r>
-        <w:t>Message format: “</w:t>
-      </w:r>
-      <w:r>
-        <w:t>0</w:t>
-      </w:r>
-      <w:r>
-        <w:t>\n”</w:t>
-      </w:r>
-    </w:p>
-    <w:p>
-      <w:pPr>
-        <w:pStyle w:val="ListParagraph"/>
-        <w:numPr>
-          <w:ilvl w:val="1"/>
-          <w:numId w:val="20"/>
-        </w:numPr>
-      </w:pPr>
-      <w:r>
-        <w:t xml:space="preserve">Message Code: </w:t>
-      </w:r>
-      <w:r>
-        <w:t>0</w:t>
-      </w:r>
-    </w:p>
-    <w:p>
-      <w:pPr>
-        <w:pStyle w:val="ListParagraph"/>
-        <w:numPr>
-          <w:ilvl w:val="0"/>
-          <w:numId w:val="20"/>
-        </w:numPr>
-      </w:pPr>
-      <w:r>
-        <w:t>Possible Error</w:t>
-      </w:r>
-      <w:r>
-        <w:t xml:space="preserve"> Codes</w:t>
-      </w:r>
-      <w:r>
-        <w:t>:</w:t>
-      </w:r>
-    </w:p>
-    <w:p>
-      <w:pPr>
-        <w:pStyle w:val="ListParagraph"/>
-        <w:numPr>
-          <w:ilvl w:val="1"/>
-          <w:numId w:val="20"/>
-        </w:numPr>
-      </w:pPr>
-      <w:r>
-        <w:t>103, 108, 109, 110, 111, 112, 113, 114, 115, 116</w:t>
+      </w:pPr>
+      <w:r>
+        <w:t>114, 116</w:t>
       </w:r>
       <w:r>
         <w:t>, 120, 121, 122, 123, 124</w:t>
       </w:r>
+      <w:r>
+        <w:t>, 126</w:t>
+      </w:r>
     </w:p>
     <w:p>
       <w:r>
@@ -5169,231 +5666,18 @@
     </w:p>
     <w:p>
       <w:pPr>
-        <w:pStyle w:val="Heading3"/>
-        <w:spacing w:line="360" w:lineRule="auto"/>
-      </w:pPr>
-      <w:r>
-        <w:lastRenderedPageBreak/>
-        <w:t xml:space="preserve">Cycle Tool </w:t>
-      </w:r>
-      <w:r>
-        <w:t>Function</w:t>
-      </w:r>
-    </w:p>
-    <w:p>
-      <w:r>
-        <w:t xml:space="preserve">Initiates a tool cycle sequence. The controller will respond with a message code for each step of the process until the tool cycle is completed or an error prevents completion. A full tool cycle </w:t>
-      </w:r>
-      <w:r>
-        <w:t>is as follows:</w:t>
-      </w:r>
-    </w:p>
-    <w:p>
-      <w:pPr>
-        <w:pStyle w:val="ListParagraph"/>
-        <w:numPr>
-          <w:ilvl w:val="0"/>
-          <w:numId w:val="26"/>
-        </w:numPr>
-      </w:pPr>
-      <w:r>
-        <w:t>Clamps engage: Message code 10</w:t>
-      </w:r>
-    </w:p>
-    <w:p>
-      <w:pPr>
-        <w:pStyle w:val="ListParagraph"/>
-        <w:numPr>
-          <w:ilvl w:val="0"/>
-          <w:numId w:val="26"/>
-        </w:numPr>
-      </w:pPr>
-      <w:r>
-        <w:t>Tool and motor enable signals sent: Message code 11 and message code 18</w:t>
-      </w:r>
-    </w:p>
-    <w:p>
-      <w:pPr>
-        <w:pStyle w:val="ListParagraph"/>
-        <w:numPr>
-          <w:ilvl w:val="0"/>
-          <w:numId w:val="26"/>
-        </w:numPr>
-      </w:pPr>
-      <w:r>
-        <w:t>Tool at rest sensor deactivated: Message code 12</w:t>
-      </w:r>
-    </w:p>
-    <w:p>
-      <w:pPr>
-        <w:pStyle w:val="ListParagraph"/>
-        <w:numPr>
-          <w:ilvl w:val="0"/>
-          <w:numId w:val="26"/>
-        </w:numPr>
-      </w:pPr>
-      <w:r>
-        <w:t>Tool at extension sensor activated: Message code 13</w:t>
-      </w:r>
-    </w:p>
-    <w:p>
-      <w:pPr>
-        <w:pStyle w:val="ListParagraph"/>
-        <w:numPr>
-          <w:ilvl w:val="0"/>
-          <w:numId w:val="26"/>
-        </w:numPr>
-      </w:pPr>
-      <w:r>
-        <w:t>Tool at extension sensor deactivated: Message code 14</w:t>
-      </w:r>
-    </w:p>
-    <w:p>
-      <w:pPr>
-        <w:pStyle w:val="ListParagraph"/>
-        <w:numPr>
-          <w:ilvl w:val="0"/>
-          <w:numId w:val="26"/>
-        </w:numPr>
-      </w:pPr>
-      <w:r>
-        <w:t>Tool at rest sensor activated: Message code 15</w:t>
-      </w:r>
-    </w:p>
-    <w:p>
-      <w:pPr>
-        <w:pStyle w:val="ListParagraph"/>
-        <w:numPr>
-          <w:ilvl w:val="0"/>
-          <w:numId w:val="26"/>
-        </w:numPr>
-      </w:pPr>
-      <w:r>
-        <w:t>Clamps disengaged: Message code 16</w:t>
-      </w:r>
-    </w:p>
-    <w:p>
-      <w:pPr>
-        <w:pStyle w:val="ListParagraph"/>
-        <w:numPr>
-          <w:ilvl w:val="0"/>
-          <w:numId w:val="26"/>
-        </w:numPr>
-      </w:pPr>
-      <w:r>
-        <w:t>Tool cycle complete: Message code 17</w:t>
-      </w:r>
-    </w:p>
-    <w:p>
-      <w:pPr>
-        <w:pStyle w:val="Heading4"/>
-        <w:spacing w:line="360" w:lineRule="auto"/>
-      </w:pPr>
-      <w:r>
-        <w:t>Request</w:t>
-      </w:r>
-    </w:p>
-    <w:p>
-      <w:pPr>
-        <w:pStyle w:val="ListParagraph"/>
-        <w:numPr>
-          <w:ilvl w:val="0"/>
-          <w:numId w:val="20"/>
-        </w:numPr>
-        <w:spacing w:line="360" w:lineRule="auto"/>
-      </w:pPr>
-      <w:r>
-        <w:t>Identifier: “</w:t>
-      </w:r>
-      <w:proofErr w:type="spellStart"/>
-      <w:r>
-        <w:t>cycle_tool</w:t>
-      </w:r>
-      <w:proofErr w:type="spellEnd"/>
-      <w:r>
-        <w:t>”</w:t>
-      </w:r>
-    </w:p>
-    <w:p>
-      <w:pPr>
-        <w:pStyle w:val="ListParagraph"/>
-        <w:numPr>
-          <w:ilvl w:val="0"/>
-          <w:numId w:val="20"/>
-        </w:numPr>
-        <w:spacing w:line="360" w:lineRule="auto"/>
-      </w:pPr>
-      <w:r>
-        <w:t>Parameters: None</w:t>
-      </w:r>
-    </w:p>
-    <w:p>
-      <w:pPr>
-        <w:pStyle w:val="Heading4"/>
-        <w:spacing w:line="360" w:lineRule="auto"/>
-      </w:pPr>
-      <w:r>
-        <w:t>Response</w:t>
-      </w:r>
-    </w:p>
-    <w:p>
-      <w:pPr>
-        <w:pStyle w:val="ListParagraph"/>
-        <w:numPr>
-          <w:ilvl w:val="0"/>
-          <w:numId w:val="20"/>
-        </w:numPr>
-      </w:pPr>
-      <w:r>
-        <w:t>Possible Error Codes:</w:t>
-      </w:r>
-    </w:p>
-    <w:p>
-      <w:pPr>
-        <w:pStyle w:val="ListParagraph"/>
-        <w:numPr>
-          <w:ilvl w:val="1"/>
-          <w:numId w:val="20"/>
-        </w:numPr>
-      </w:pPr>
-      <w:r>
-        <w:t>114, 116</w:t>
-      </w:r>
-      <w:r>
-        <w:t>, 120, 121, 122, 123, 124</w:t>
-      </w:r>
-      <w:r>
-        <w:t>, 126</w:t>
-      </w:r>
-    </w:p>
-    <w:p>
-      <w:r>
-        <w:br w:type="page"/>
-      </w:r>
-    </w:p>
-    <w:p>
-      <w:pPr>
         <w:pStyle w:val="Heading2"/>
         <w:spacing w:line="360" w:lineRule="auto"/>
       </w:pPr>
       <w:bookmarkStart w:id="14" w:name="_Toc188363613"/>
       <w:r>
-        <w:lastRenderedPageBreak/>
         <w:t>Signals</w:t>
       </w:r>
       <w:bookmarkEnd w:id="14"/>
     </w:p>
     <w:p>
       <w:r>
-        <w:t xml:space="preserve">Signals are messages that occur during certain operations of </w:t>
-      </w:r>
-      <w:proofErr w:type="gramStart"/>
-      <w:r>
-        <w:t>the TigerStop</w:t>
-      </w:r>
-      <w:proofErr w:type="gramEnd"/>
-      <w:r>
-        <w:t>. These messages</w:t>
+        <w:t>Signals are messages that occur during certain operations of the TigerStop. These messages</w:t>
       </w:r>
       <w:r>
         <w:t xml:space="preserve"> may </w:t>
@@ -8900,7 +9184,7 @@
   <w:style w:type="paragraph" w:default="1" w:styleId="Normal">
     <w:name w:val="Normal"/>
     <w:qFormat/>
-    <w:rsid w:val="00C50A32"/>
+    <w:rsid w:val="008978D4"/>
   </w:style>
   <w:style w:type="paragraph" w:styleId="Heading1">
     <w:name w:val="heading 1"/>

</xml_diff>